<commit_message>
Add Closing part: The Ten Rules (What Should Have Been Carved Instead)
Unnumbered end part after Chapter Thirteen, mirroring the unnumbered Opening so both prefaces' 'thirteen chapters' statements remain true. Includes the ten rules verbatim in bold with title-case headings, The Seven Year Slate, Two Hard Questions, and The Objection. TOC entry added after Ch. 13. Zero em dashes, house style intact.
</commit_message>
<xml_diff>
--- a/version-2.0.1/The_Hitchhikers_Guide_to_the_Homo_Sapiens_v2.0.1.docx
+++ b/version-2.0.1/The_Hitchhikers_Guide_to_the_Homo_Sapiens_v2.0.1.docx
@@ -1248,6 +1248,12 @@
       </w:r>
     </w:p>
     <w:p>
+      <w:pPr/>
+      <w:r>
+        <w:t>Closing The Ten Rules. What Should Have Been Carved Instead</w:t>
+      </w:r>
+    </w:p>
+    <w:p>
       <w:pPr>
         <w:spacing w:after="142" w:line="259" w:lineRule="auto"/>
         <w:ind w:left="-5"/>
@@ -20775,6 +20781,552 @@
       </w:pPr>
       <w:r>
         <w:t>That is the weld, and that is the exit. It was never a door leading out of the world. It was the part of you that gets to decide, finally and for the rest of your life, what gets to walk through it.</w:t>
+      </w:r>
+    </w:p>
+    <w:p>
+      <w:pPr/>
+      <w:r>
+        <w:br w:type="page"/>
+      </w:r>
+      <w:r>
+        <w:t>CLOSING</w:t>
+      </w:r>
+    </w:p>
+    <w:p>
+      <w:pPr>
+        <w:pStyle w:val="Heading1"/>
+      </w:pPr>
+      <w:r>
+        <w:t>The Ten Rules</w:t>
+      </w:r>
+    </w:p>
+    <w:p>
+      <w:pPr/>
+      <w:r>
+        <w:t>What Should Have Been Carved Instead</w:t>
+      </w:r>
+    </w:p>
+    <w:p>
+      <w:pPr/>
+      <w:r>
+        <w:t>Somewhere around four thousand years ago, by the account most of the West inherited, a set of instructions was handed down for how human beings should live. Ten of them, short enough to memorize and portable enough to carry, and still quoted today in courtrooms by people who could not tell you where they came from.</w:t>
+      </w:r>
+    </w:p>
+    <w:p>
+      <w:pPr/>
+      <w:r>
+        <w:t>Take them seriously as engineering, because that is what they were. Somebody had one chance at compressing everything a civilization needed into something a shepherd could hold in his head. Now audit what they spent it on.</w:t>
+      </w:r>
+    </w:p>
+    <w:p>
+      <w:pPr/>
+      <w:r>
+        <w:t>Four of the ten are about the authority itself. No other gods, no images, do not misuse the name, keep the day set aside. Forty percent of the most valuable transmission slot in human history went to protecting the standing of whoever was issuing the instructions.</w:t>
+      </w:r>
+    </w:p>
+    <w:p>
+      <w:pPr/>
+      <w:r>
+        <w:t>Five of the remaining six are ordinary prohibitions that every society on earth had already worked out on its own, because no group survives without them. Do not murder. Do not steal. Do not lie about your neighbor. Peoples who never heard the list arrived at every one. The last is a rule about wanting things, which nobody can observe and therefore nobody can enforce.</w:t>
+      </w:r>
+    </w:p>
+    <w:p>
+      <w:pPr/>
+      <w:r>
+        <w:t>Nothing in the ten says how a government should be ordered. Nothing says how a group larger than a household should coordinate. Nothing restrains an institution, because every rule is aimed at an individual, which means a state can break all ten at once while every citizen inside it stays personally innocent. Nothing expires. And nothing anywhere in the list allows the list to be changed.</w:t>
+      </w:r>
+    </w:p>
+    <w:p>
+      <w:pPr/>
+      <w:r>
+        <w:rPr>
+          <w:i/>
+        </w:rPr>
+        <w:t>That last absence is the fatal one. Instructions with no revision clause are not a constitution. They are a lock. They can only be obeyed or abandoned, and both of those outcomes serve whoever is holding the chisel.</w:t>
+      </w:r>
+    </w:p>
+    <w:p>
+      <w:pPr/>
+      <w:r>
+        <w:t>So if you had that slot, and one shot at it, and you already knew what the next four thousand years were going to cost, what would you carve instead? Not rules for a person. A person is not where the damage happens. Rules for the thing that does the damage, which is a group large enough that nobody inside it feels responsible for what it does.</w:t>
+      </w:r>
+    </w:p>
+    <w:p>
+      <w:pPr/>
+      <w:r>
+        <w:t>And they would have to be written the way the first ten were written, in words a child can hold, because a rule a child cannot repeat is a rule that will not survive one generation.</w:t>
+      </w:r>
+    </w:p>
+    <w:p>
+      <w:pPr>
+        <w:pStyle w:val="Heading2"/>
+      </w:pPr>
+      <w:r>
+        <w:t>One, If Someone Is Hungry, Feed Them</w:t>
+      </w:r>
+    </w:p>
+    <w:p>
+      <w:pPr/>
+      <w:r>
+        <w:rPr>
+          <w:b/>
+        </w:rPr>
+        <w:t>If someone is hungry, feed them.</w:t>
+      </w:r>
+    </w:p>
+    <w:p>
+      <w:pPr/>
+      <w:r>
+        <w:t>Not grudgingly, and not after asking what they did to deserve it. The way you would feed your own child, with the same face you would use on your own child, and then ask if they need anything else. Food, a place to sleep, and something to wear are the three things a person cannot live without, and a society that can produce far more of all three than it needs and still has people without them has not run out of food. It has run out of the willingness to hand it over. Repairing something and giving it again is not a lesser gift. It was good enough for the person who owned it until the day they stopped, so it is good enough for one more. And it must never once be possible to say that a person took too much. The moment that sentence is available, the rule is gone, because everyone who needs help will hear it before they ask.</w:t>
+      </w:r>
+    </w:p>
+    <w:p>
+      <w:pPr>
+        <w:pStyle w:val="Heading2"/>
+      </w:pPr>
+      <w:r>
+        <w:t>Two, If Someone Is Hurt, Help Them</w:t>
+      </w:r>
+    </w:p>
+    <w:p>
+      <w:pPr/>
+      <w:r>
+        <w:rPr>
+          <w:b/>
+        </w:rPr>
+        <w:t>If someone is hurt, help them.</w:t>
+      </w:r>
+    </w:p>
+    <w:p>
+      <w:pPr/>
+      <w:r>
+        <w:t>Anyone. Including a stranger, including someone you dislike, including someone from the other side of whatever line is currently being drawn. A person bleeding in front of you is not a member of a group at that moment, and treating them as one is the beginning of every atrocity in this book. This runs the other direction as well. If you hurt someone, you answer for it. If you sell food you know is poisoned, or medicine you know does not work, or a house you know will not stand, you have not made a bad business decision. You have hurt someone for money, which is worse than hurting them in anger, because anger passes and a decision to profit does not.</w:t>
+      </w:r>
+    </w:p>
+    <w:p>
+      <w:pPr>
+        <w:pStyle w:val="Heading2"/>
+      </w:pPr>
+      <w:r>
+        <w:t>Three, After Seven Years the Debt Is Gone</w:t>
+      </w:r>
+    </w:p>
+    <w:p>
+      <w:pPr/>
+      <w:r>
+        <w:rPr>
+          <w:b/>
+        </w:rPr>
+        <w:t>After seven years, the debt is gone.</w:t>
+      </w:r>
+    </w:p>
+    <w:p>
+      <w:pPr/>
+      <w:r>
+        <w:t>Every debt, without exception and without appeal. Seven years is the whole life of an obligation, and after that the slate is wiped, whatever remains unpaid is finished, and whatever was pledged against it belongs to the person who was carrying it. Nobody has to forgive anything, and no creditor has to be persuaded. The calendar does it, which is the only way it has ever been done, because no lender in history has volunteered.</w:t>
+      </w:r>
+    </w:p>
+    <w:p>
+      <w:pPr>
+        <w:pStyle w:val="Heading2"/>
+      </w:pPr>
+      <w:r>
+        <w:t>Four, Nobody Keeps a Powerful Job Forever</w:t>
+      </w:r>
+    </w:p>
+    <w:p>
+      <w:pPr/>
+      <w:r>
+        <w:rPr>
+          <w:b/>
+        </w:rPr>
+        <w:t>Nobody keeps a powerful job forever.</w:t>
+      </w:r>
+    </w:p>
+    <w:p>
+      <w:pPr/>
+      <w:r>
+        <w:t>Every seat with power over other people empties on a fixed date that everyone knows in advance, no matter how good the person in it is and no matter what is happening at the time. Emergencies are exactly when this rule gets suspended, which is exactly why it must not be. A job you can hold indefinitely stops being a job and becomes something you own, and people defend what they own. Most of what gets called corruption is just an office that outlasted its reason.</w:t>
+      </w:r>
+    </w:p>
+    <w:p>
+      <w:pPr>
+        <w:pStyle w:val="Heading2"/>
+      </w:pPr>
+      <w:r>
+        <w:t>Five, Every Choice Has a Name on It</w:t>
+      </w:r>
+    </w:p>
+    <w:p>
+      <w:pPr/>
+      <w:r>
+        <w:rPr>
+          <w:b/>
+        </w:rPr>
+        <w:t>Every choice has a name on it.</w:t>
+      </w:r>
+    </w:p>
+    <w:p>
+      <w:pPr/>
+      <w:r>
+        <w:t>Not a department, not a committee, not a process, not a system. A person, named, who can be asked why. A person can be questioned, refused, removed, prosecuted, and made to sit in a room with the people it happened to. None of those can be done to an institution. When responsibility is shared by everyone it is held by nobody, and the harm arrives with no name attached to it. Every death gets counted and every death gets answered, without exception, because a death nobody answers for is a public announcement of the price of the next one.</w:t>
+      </w:r>
+    </w:p>
+    <w:p>
+      <w:pPr>
+        <w:pStyle w:val="Heading2"/>
+      </w:pPr>
+      <w:r>
+        <w:t>Six, Nobody Can Buy a Rule</w:t>
+      </w:r>
+    </w:p>
+    <w:p>
+      <w:pPr/>
+      <w:r>
+        <w:rPr>
+          <w:b/>
+        </w:rPr>
+        <w:t>Nobody can buy a rule.</w:t>
+      </w:r>
+    </w:p>
+    <w:p>
+      <w:pPr/>
+      <w:r>
+        <w:t>No money may move, in any direction and under any name, between the people who make the rules and the people the rules are made about. Not a payment, not a gift, not a job offered afterward, not a donation to something a family member runs. This is the single most efficient way to corrupt a government that has ever been invented, and it does not require anyone to be a criminal. It requires only that the people who write the rules and the people who profit from them are allowed to be in the same room with a checkbook. If money is the root of anything, it is this: not coins, but the ability to pay a stranger to decide in your favor and call the result a law.</w:t>
+      </w:r>
+    </w:p>
+    <w:p>
+      <w:pPr>
+        <w:pStyle w:val="Heading2"/>
+      </w:pPr>
+      <w:r>
+        <w:t>Seven, Use Words a Child Knows</w:t>
+      </w:r>
+    </w:p>
+    <w:p>
+      <w:pPr/>
+      <w:r>
+        <w:rPr>
+          <w:b/>
+        </w:rPr>
+        <w:t>Use words a child knows.</w:t>
+      </w:r>
+    </w:p>
+    <w:p>
+      <w:pPr/>
+      <w:r>
+        <w:t>In every public act, every law, every order, every explanation given by anyone with power. If a thing cannot be described in words a ten-year-old understands, it may not be done in the name of the people. This is not a rule about style. Every large cruelty in recorded history arrived wearing a phrase built to stop the listener from picturing it, and the phrase is not decoration on the act. It is part of the machinery, because a thing nobody can picture is a thing nobody stops.</w:t>
+      </w:r>
+    </w:p>
+    <w:p>
+      <w:pPr>
+        <w:pStyle w:val="Heading2"/>
+      </w:pPr>
+      <w:r>
+        <w:t>Eight, You Cannot Hide It From the People It Happens To</w:t>
+      </w:r>
+    </w:p>
+    <w:p>
+      <w:pPr/>
+      <w:r>
+        <w:rPr>
+          <w:b/>
+        </w:rPr>
+        <w:t>You cannot hide it from the people it happens to.</w:t>
+      </w:r>
+    </w:p>
+    <w:p>
+      <w:pPr/>
+      <w:r>
+        <w:t>Anyone a decision is made about is entitled to the record of it. Secrecy may delay that for a stated time, named in advance, and may never cancel it. Nothing that takes from a group survives being watched by that group. That is why every arrangement of the kind spends so much of its energy on not being watched, and why the demand to look away is never a denial. It is a request for help.</w:t>
+      </w:r>
+    </w:p>
+    <w:p>
+      <w:pPr>
+        <w:pStyle w:val="Heading2"/>
+      </w:pPr>
+      <w:r>
+        <w:t>Nine, Anyone Can Walk Away</w:t>
+      </w:r>
+    </w:p>
+    <w:p>
+      <w:pPr/>
+      <w:r>
+        <w:rPr>
+          <w:b/>
+        </w:rPr>
+        <w:t>Anyone can walk away.</w:t>
+      </w:r>
+    </w:p>
+    <w:p>
+      <w:pPr/>
+      <w:r>
+        <w:t>No group may be built so that leaving costs you your family, your work, your standing, and your account of what happens when you die. Leaving may cost you the thing itself and nothing more. A promise you cannot withdraw is not loyalty. It is capture. And the true strength of any group is the number of people who stay once the door is genuinely open.</w:t>
+      </w:r>
+    </w:p>
+    <w:p>
+      <w:pPr>
+        <w:pStyle w:val="Heading2"/>
+      </w:pPr>
+      <w:r>
+        <w:t>Ten, Every Twenty Years New People Read These Rules and Fix Them</w:t>
+      </w:r>
+    </w:p>
+    <w:p>
+      <w:pPr/>
+      <w:r>
+        <w:rPr>
+          <w:b/>
+        </w:rPr>
+        <w:t>Every twenty years, new people read these rules and fix them.</w:t>
+      </w:r>
+    </w:p>
+    <w:p>
+      <w:pPr/>
+      <w:r>
+        <w:t>In public, on a schedule, by people who had no hand in writing them, with full power to change or delete any of the nine above and this one. A rule that survives only because it was inherited has stopped being a rule and become a habit. This is last because it is the only thing that makes the other nine safe, and its absence is the exact defect that ruined every code that came before.</w:t>
+      </w:r>
+    </w:p>
+    <w:p>
+      <w:pPr>
+        <w:pStyle w:val="Heading2"/>
+      </w:pPr>
+      <w:r>
+        <w:t>The Seven Year Slate</w:t>
+      </w:r>
+    </w:p>
+    <w:p>
+      <w:pPr/>
+      <w:r>
+        <w:rPr>
+          <w:i/>
+        </w:rPr>
+        <w:t>On Rule Three, and where the phrase comes from.</w:t>
+      </w:r>
+    </w:p>
+    <w:p>
+      <w:pPr/>
+      <w:r>
+        <w:t>People say wipe the slate clean without knowing they are talking about money, and the original is worth having, because it goes straight back to the beginning.</w:t>
+      </w:r>
+    </w:p>
+    <w:p>
+      <w:pPr/>
+      <w:r>
+        <w:t>Before paper was cheap, a tavern keeper kept a piece of slate on the wall. When a man drank and could not pay, the amount went on the slate in chalk under his name, and it stayed there in front of everyone until he settled. When he paid, the keeper wiped it off with a cloth, and the stone was blank again as though nothing had ever been owed.</w:t>
+      </w:r>
+    </w:p>
+    <w:p>
+      <w:pPr/>
+      <w:r>
+        <w:t>The Latin behind it is older and says the same thing. A tabula rasa is a scraped tablet: a Roman wax board that had been written on and then heated and smoothed flat, so that whatever it had recorded was simply not there anymore.</w:t>
+      </w:r>
+    </w:p>
+    <w:p>
+      <w:pPr/>
+      <w:r>
+        <w:rPr>
+          <w:i/>
+        </w:rPr>
+        <w:t>A clean slate has never meant a fresh mind or a new start in the vague sense people use it now. It meant a debt erased. The oldest phrase we have for freedom in English is a description of somebody wiping what you owed off a stone.</w:t>
+      </w:r>
+    </w:p>
+    <w:p>
+      <w:pPr/>
+      <w:r>
+        <w:t>So Rule Three is not an invention. It is the phrase taken literally, and put on a calendar so that it does not depend on the goodwill of the man holding the cloth.</w:t>
+      </w:r>
+    </w:p>
+    <w:p>
+      <w:pPr>
+        <w:pStyle w:val="Heading2"/>
+      </w:pPr>
+      <w:r>
+        <w:t>How You Keep Score Without Keeping a Chain</w:t>
+      </w:r>
+    </w:p>
+    <w:p>
+      <w:pPr/>
+      <w:r>
+        <w:t>A debt that expires does not mean a promise that never mattered. There still has to be a way to know whether a person keeps their word, or nobody will lend anything to anyone. The answer is to record the honor rather than the money.</w:t>
+      </w:r>
+    </w:p>
+    <w:p>
+      <w:pPr/>
+      <w:r>
+        <w:t>Not a number. A history. Did this person agree to a thing and then do it? How many agreements have they completed? How many ran the full seven years and finished unpaid?</w:t>
+      </w:r>
+    </w:p>
+    <w:p>
+      <w:pPr/>
+      <w:r>
+        <w:t>That record is the only asset any of us actually carry, and it is far more informative than a balance, because a balance tells you what someone has and honor tells you what they do.</w:t>
+      </w:r>
+    </w:p>
+    <w:p>
+      <w:pPr/>
+      <w:r>
+        <w:t>And that record expires too, on the same clock. Seven years, and the mark is gone. Not sealed, not archived, not available to anyone who pays for access. Gone, the way chalk goes when a cloth crosses it, so that no person can be held for life against the worst season they ever had.</w:t>
+      </w:r>
+    </w:p>
+    <w:p>
+      <w:pPr/>
+      <w:r>
+        <w:rPr>
+          <w:i/>
+        </w:rPr>
+        <w:t>Everyone gets to fail, and everyone gets to stop having failed. Any system that remembers forever has quietly decided that a person is the worst thing they have ever done, and no society that believes that has ever been a good place to live in.</w:t>
+      </w:r>
+    </w:p>
+    <w:p>
+      <w:pPr>
+        <w:pStyle w:val="Heading2"/>
+      </w:pPr>
+      <w:r>
+        <w:t>Two Hard Questions</w:t>
+      </w:r>
+    </w:p>
+    <w:p>
+      <w:pPr/>
+      <w:r>
+        <w:rPr>
+          <w:i/>
+        </w:rPr>
+        <w:t>Which any set of rules has to answer, or admit it cannot.</w:t>
+      </w:r>
+    </w:p>
+    <w:p>
+      <w:pPr/>
+      <w:r>
+        <w:rPr>
+          <w:b/>
+        </w:rPr>
+        <w:t>What do you do with someone who hurts people?</w:t>
+      </w:r>
+    </w:p>
+    <w:p>
+      <w:pPr/>
+      <w:r>
+        <w:t>Rule Two says the person who is hurt gets helped and the person who did it answers for it. It does not say what answering means, and that is the question every society actually fights about.</w:t>
+      </w:r>
+    </w:p>
+    <w:p>
+      <w:pPr/>
+      <w:r>
+        <w:t>Start from what is being purchased. Punishment buys three different things and they are usually confused with each other: stopping this person from doing it again, discouraging the next person, and satisfying the feeling of the people who were harmed. Only the first is a safety measure. The second is a claim about deterrence that mostly does not survive being measured. The third is real, and it is not nothing, but it is a feeling and should be named as one rather than dressed up as justice.</w:t>
+      </w:r>
+    </w:p>
+    <w:p>
+      <w:pPr/>
+      <w:r>
+        <w:t>So the rule is this. Separate a person from others only for as long as they are actually dangerous, and prove it again on a schedule rather than assuming it. Everything else that happens to them during that time should be aimed at the day they come out, because almost all of them come out, and a system that returns a person worse than it received him has not protected anybody. It has bought a few quiet years and paid for them with the next victim.</w:t>
+      </w:r>
+    </w:p>
+    <w:p>
+      <w:pPr/>
+      <w:r>
+        <w:rPr>
+          <w:i/>
+        </w:rPr>
+        <w:t>Ask the only question that measures anything: does this person harm someone again? Every practice that lowers that number is justice, whatever it feels like, and every practice that raises it is revenge wearing a uniform, however satisfying it is to watch.</w:t>
+      </w:r>
+    </w:p>
+    <w:p>
+      <w:pPr/>
+      <w:r>
+        <w:t>And Rule Ten applies here more than anywhere. A society that never reexamines what it does to its prisoners will discover, every single time, that it has been running a machine for producing the exact people it says it is protecting itself from.</w:t>
+      </w:r>
+    </w:p>
+    <w:p>
+      <w:pPr/>
+      <w:r>
+        <w:rPr>
+          <w:b/>
+        </w:rPr>
+        <w:t>What does a country do when it is attacked?</w:t>
+      </w:r>
+    </w:p>
+    <w:p>
+      <w:pPr/>
+      <w:r>
+        <w:t>This is the hardest one in the set, and any rule that pretends otherwise is lying.</w:t>
+      </w:r>
+    </w:p>
+    <w:p>
+      <w:pPr/>
+      <w:r>
+        <w:t>A state that is attacked will strike back. That is not a policy choice; it is what states do, and a rule that simply forbids it will be ignored the first morning it matters. So the rule has to constrain the striking rather than deny it.</w:t>
+      </w:r>
+    </w:p>
+    <w:p>
+      <w:pPr/>
+      <w:r>
+        <w:t>Rule Five carries most of the weight. A name on every order, before it is given. Not afterward, not in a review two years later, but attached at the moment of decision, so that the person who authorizes a strike knows their name will sit beside the result forever. Almost nothing else changes behavior. It is far easier to sign for a target than to sign for a school, and the entire purpose of every euphemism in Rule Seven is to make those two feel like the same signature.</w:t>
+      </w:r>
+    </w:p>
+    <w:p>
+      <w:pPr/>
+      <w:r>
+        <w:t>Then Rule Seven does the rest. Describe the target in words a child understands before the order is valid. Not neutralize the site. Say what is there. If the sentence cannot be said out loud in plain language to the people whose name it is done in, it does not get signed.</w:t>
+      </w:r>
+    </w:p>
+    <w:p>
+      <w:pPr/>
+      <w:r>
+        <w:t>There is a harder version of the question underneath, and it deserves an honest answer rather than a slogan. When one side fights from bases and the other fights from among houses, any strike at the second reaches people who chose nothing. Calling that unavoidable is usually a way of avoiding the decision rather than describing it.</w:t>
+      </w:r>
+    </w:p>
+    <w:p>
+      <w:pPr/>
+      <w:r>
+        <w:t>The rules here do not solve that, and no rule does. What they change is who has to own it. Under Rule Five somebody signs, by name. Under Rule Seven that person has to write down what they are actually aiming at, in words their own child could read. Under Rule Eight it cannot be sealed from the people it happened to. And under Rule Two every death is counted, including theirs, on the same list, in the same numbers, in public.</w:t>
+      </w:r>
+    </w:p>
+    <w:p>
+      <w:pPr/>
+      <w:r>
+        <w:rPr>
+          <w:i/>
+        </w:rPr>
+        <w:t>You cannot legislate a war into being clean. You can make it impossible to conduct one anonymously, and almost every atrocity in this book required anonymity somewhere in the chain.</w:t>
+      </w:r>
+    </w:p>
+    <w:p>
+      <w:pPr>
+        <w:pStyle w:val="Heading2"/>
+      </w:pPr>
+      <w:r>
+        <w:t>The Objection</w:t>
+      </w:r>
+    </w:p>
+    <w:p>
+      <w:pPr/>
+      <w:r>
+        <w:rPr>
+          <w:i/>
+        </w:rPr>
+        <w:t>These would have been ignored, and that objection is correct.</w:t>
+      </w:r>
+    </w:p>
+    <w:p>
+      <w:pPr/>
+      <w:r>
+        <w:t>Rules One, Three, Six and Nine cost the people carving them everything they had, which is exactly why no ancient code contains anything resembling them. Every law that survives from that period was written by whoever had already won, and Rule Ten, the one that hands the code to strangers every twenty years and lets them change it, is the last thing a winner ever writes down.</w:t>
+      </w:r>
+    </w:p>
+    <w:p>
+      <w:pPr/>
+      <w:r>
+        <w:t>Which is the actual argument, and it is not about antiquity. The old ten are not defective because their authors were primitive. They are defective in the exact direction that served the people holding the chisel, and four thousand years later almost every institution still runs on a code with the same shape: strict about personal conduct, silent about power, and containing no instruction for its own repair.</w:t>
+      </w:r>
+    </w:p>
+    <w:p>
+      <w:pPr/>
+      <w:r>
+        <w:rPr>
+          <w:i/>
+        </w:rPr>
+        <w:t>You do not need a mountain to fix that. You need a calendar, a name on every decision, plain words, an open door, and a rule that says this list gets read again by people who had no hand in writing it.</w:t>
       </w:r>
     </w:p>
     <w:p>

</xml_diff>

<commit_message>
Correct byline to A.M. Covino (title page, copyright, second title page)
</commit_message>
<xml_diff>
--- a/version-2.0.1/The_Hitchhikers_Guide_to_the_Homo_Sapiens_v2.0.1.docx
+++ b/version-2.0.1/The_Hitchhikers_Guide_to_the_Homo_Sapiens_v2.0.1.docx
@@ -61,7 +61,7 @@
         <w:ind w:left="-5" w:right="15"/>
       </w:pPr>
       <w:r>
-        <w:t>Ammon M. Covino</w:t>
+        <w:t>A.M. Covino</w:t>
       </w:r>
     </w:p>
     <w:p>
@@ -100,7 +100,7 @@
         <w:t xml:space="preserve">An Operating Manual for Life </w:t>
       </w:r>
       <w:r>
-        <w:t>Copyright © 2026 by Ammon M. Covino</w:t>
+        <w:t>Copyright © 2026 by A.M. Covino</w:t>
       </w:r>
     </w:p>
     <w:p>
@@ -985,7 +985,7 @@
         <w:ind w:left="-5" w:right="15"/>
       </w:pPr>
       <w:r>
-        <w:t>Ammon M. Covino</w:t>
+        <w:t>A.M. Covino</w:t>
       </w:r>
     </w:p>
     <w:p>

</xml_diff>

<commit_message>
P0 notes-system repair: renumber all markers and notes 1-25 in reading order, restore marker-note correspondence, rehome orphaned note 22, retarget Ch.3 marker
</commit_message>
<xml_diff>
--- a/version-2.0.1/The_Hitchhikers_Guide_to_the_Homo_Sapiens_v2.0.1.docx
+++ b/version-2.0.1/The_Hitchhikers_Guide_to_the_Homo_Sapiens_v2.0.1.docx
@@ -2276,16 +2276,15 @@
         <w:ind w:left="-5" w:right="15"/>
       </w:pPr>
       <w:r>
-        <w:t>In this book’s model, the interesting move is not replacing the word god with the word mitochondrion. It is moving from an external explanation to mechanisms that can be investigated, while admitting where the historical record no longer permits certainty. The Scottish evangelist Henry Drummond named this habit in his Lowell Lectures of 1893, and he was not attacking religion but defending it. There are reverent minds, he wrote, who ceaselessly scan the fields of Nature and the books of Science in search of gaps, gaps which they will fill up with God. As if God lived in gaps. [2]</w:t>
-      </w:r>
-    </w:p>
-    <w:p>
-      <w:pPr>
-        <w:ind w:left="-5" w:right="15"/>
-      </w:pPr>
-      <w:r>
-        <w:lastRenderedPageBreak/>
-        <w:t>Sixty years later the chemist Charles Coulson gave the habit its permanent name and its obituary in the same sentence. There is no God of the gaps to take over at those strategic places where science fails, he wrote, and the reason is that gaps of this sort have the unpreventable habit of shrinking. [2]</w:t>
+        <w:t>In this book’s model, the interesting move is not replacing the word god with the word mitochondrion. It is moving from an external explanation to mechanisms that can be investigated, while admitting where the historical record no longer permits certainty. The Scottish evangelist Henry Drummond named this habit in his Lowell Lectures of 1893, and he was not attacking religion but defending it. There are reverent minds, he wrote, who ceaselessly scan the fields of Nature and the books of Science in search of gaps, gaps which they will fill up with God. As if God lived in gaps. [1]</w:t>
+      </w:r>
+    </w:p>
+    <w:p>
+      <w:pPr>
+        <w:ind w:left="-5" w:right="15"/>
+      </w:pPr>
+      <w:r>
+        <w:t>Sixty years later the chemist Charles Coulson gave the habit its permanent name and its obituary in the same sentence. There is no God of the gaps to take over at those strategic places where science fails, he wrote, and the reason is that gaps of this sort have the unpreventable habit of shrinking. [1]</w:t>
       </w:r>
     </w:p>
     <w:p>
@@ -2322,7 +2321,7 @@
         <w:ind w:left="-5" w:right="15"/>
       </w:pPr>
       <w:r>
-        <w:t>The indictment, as Plato records it, was that Socrates was guilty of corrupting the young, and of not believing in the gods the city believed in, but in other new divinities. [1] Teaching people the wrong things, and causing a disruption. That is the charge. Everything else was commentary.</w:t>
+        <w:t>The indictment, as Plato records it, was that Socrates was guilty of corrupting the young, and of not believing in the gods the city believed in, but in other new divinities. [2] Teaching people the wrong things, and causing a disruption. That is the charge. Everything else was commentary.</w:t>
       </w:r>
     </w:p>
     <w:p>
@@ -4889,15 +4888,15 @@
         <w:ind w:left="-5" w:right="15"/>
       </w:pPr>
       <w:r>
-        <w:t>Alan Watts spent his career pointing at something most people feel and cannot name. We have two kinds of consciousness, he said, and we are trained from childhood to identify with only one of them. The first he called the spotlight: narrow, deliberate, the beam you aim at whatever you have decided matters. The second he called the floodlight: broad, constant, running underneath, taking in the road and the traffic and the room while the spotlight is busy elsewhere. [25]</w:t>
-      </w:r>
-    </w:p>
-    <w:p>
-      <w:pPr>
-        <w:ind w:left="-5" w:right="15"/>
-      </w:pPr>
-      <w:r>
-        <w:t>The price of specializing in the spotlight, he wrote, is ignorance of everything outside its field, and he liked to break the word open when he said it, because what it actually describes is not stupidity but a decision. Conscious attention, in his phrase, is at the same time ignore-ance. [25]</w:t>
+        <w:t>Alan Watts spent his career pointing at something most people feel and cannot name. We have two kinds of consciousness, he said, and we are trained from childhood to identify with only one of them. The first he called the spotlight: narrow, deliberate, the beam you aim at whatever you have decided matters. The second he called the floodlight: broad, constant, running underneath, taking in the road and the traffic and the room while the spotlight is busy elsewhere. [3]</w:t>
+      </w:r>
+    </w:p>
+    <w:p>
+      <w:pPr>
+        <w:ind w:left="-5" w:right="15"/>
+      </w:pPr>
+      <w:r>
+        <w:t>The price of specializing in the spotlight, he wrote, is ignorance of everything outside its field, and he liked to break the word open when he said it, because what it actually describes is not stupidity but a decision. Conscious attention, in his phrase, is at the same time ignore-ance. [3]</w:t>
       </w:r>
     </w:p>
     <w:p>
@@ -5284,7 +5283,7 @@
         <w:ind w:left="-5" w:right="15"/>
       </w:pPr>
       <w:r>
-        <w:t>Miyamoto Musashi was a real seventeenth-century swordsman, and his duel with Sasaki Kojirō is part of the historical record. The version almost everyone knows, however, was polished by later retelling. The theatrical lateness, the oar carved during the crossing, its exact length, the discarded scabbard, and the precise psychological sequence are not details this book can present as if a neutral witness wrote them down that morning. [3]</w:t>
+        <w:t>Miyamoto Musashi was a real seventeenth-century swordsman, and his duel with Sasaki Kojirō is part of the historical record. The version almost everyone knows, however, was polished by later retelling. The theatrical lateness, the oar carved during the crossing, its exact length, the discarded scabbard, and the precise psychological sequence are not details this book can present as if a neutral witness wrote them down that morning. [4]</w:t>
       </w:r>
     </w:p>
     <w:p>
@@ -6737,7 +6736,7 @@
         <w:ind w:left="-5" w:right="15"/>
       </w:pPr>
       <w:r>
-        <w:t>So when a handful of provincials under military occupation began circulating an euangelion about an executed laborer, they were not choosing devotional language. They were taking the word the empire used for its own proclamations and putting a crucified man in it, which everyone hearing it in that century would have understood immediately as an act of substitution. [10]</w:t>
+        <w:t>So when a handful of provincials under military occupation began circulating an euangelion about an executed laborer, they were not choosing devotional language. They were taking the word the empire used for its own proclamations and putting a crucified man in it, which everyone hearing it in that century would have understood immediately as an act of substitution. [5]</w:t>
       </w:r>
     </w:p>
     <w:p>
@@ -6922,23 +6921,23 @@
         <w:ind w:left="-5" w:right="15"/>
       </w:pPr>
       <w:r>
-        <w:t>Almost everyone knows the image: three monkeys, one covering its eyes, one covering its ears, one covering its mouth. The popular English reading is often “see no evil, hear no evil, speak no evil,” but the image has carried multiple meanings across time and place. What follows is not a recovered original code hidden inside the carving. It is this book’s deliberate modern repurposing of it. [4]</w:t>
-      </w:r>
-    </w:p>
-    <w:p>
-      <w:pPr>
-        <w:ind w:left="-5" w:right="15"/>
-      </w:pPr>
-      <w:r>
-        <w:t>The carving everyone knows sits at Tōshō-gū in Nikkō, Japan, from the seventeenth century, as one panel in a larger sequence. The underlying maxim has older Chinese and Japanese associations with moral discipline, restraint, avoidance, and propriety; later uses have ranged all the way to satire. [4]</w:t>
-      </w:r>
-    </w:p>
-    <w:p>
-      <w:pPr>
-        <w:ind w:left="-5" w:right="15"/>
-      </w:pPr>
-      <w:r>
-        <w:t>In Japanese the familiar phrase is mizaru, kikazaru, iwazaru: see not, hear not, speak not. The negative ending -zaru also permits the monkey wordplay that gave the maxim its three animals. The Japanese phrase itself does not contain a separate word corresponding to the English “evil.” [4]</w:t>
+        <w:t>Almost everyone knows the image: three monkeys, one covering its eyes, one covering its ears, one covering its mouth. The popular English reading is often “see no evil, hear no evil, speak no evil,” but the image has carried multiple meanings across time and place. What follows is not a recovered original code hidden inside the carving. It is this book’s deliberate modern repurposing of it. [6]</w:t>
+      </w:r>
+    </w:p>
+    <w:p>
+      <w:pPr>
+        <w:ind w:left="-5" w:right="15"/>
+      </w:pPr>
+      <w:r>
+        <w:t>The carving everyone knows sits at Tōshō-gū in Nikkō, Japan, from the seventeenth century, as one panel in a larger sequence. The underlying maxim has older Chinese and Japanese associations with moral discipline, restraint, avoidance, and propriety; later uses have ranged all the way to satire. [6]</w:t>
+      </w:r>
+    </w:p>
+    <w:p>
+      <w:pPr>
+        <w:ind w:left="-5" w:right="15"/>
+      </w:pPr>
+      <w:r>
+        <w:t>In Japanese the familiar phrase is mizaru, kikazaru, iwazaru: see not, hear not, speak not. The negative ending -zaru also permits the monkey wordplay that gave the maxim its three animals. The Japanese phrase itself does not contain a separate word corresponding to the English “evil.” [6]</w:t>
       </w:r>
     </w:p>
     <w:p>
@@ -7947,7 +7946,7 @@
         <w:ind w:left="-5" w:right="15"/>
       </w:pPr>
       <w:r>
-        <w:t>On the morning of 28 February 2026, a missile struck the Shajareh Tayyebeh elementary school in Minab, in southern Iran. Somewhere between a hundred and seventy and two hundred and sixty children were inside. Amnesty International concluded that U.S. forces were responsible, found a Tomahawk likely visible in footage of the wider attack on the adjoining compound, and stated expressly that it could not independently verify whether the school itself was struck by that same munition. That distinction is kept here because this book is about to ask other people to be careful with evidence. [6]</w:t>
+        <w:t>On the morning of 28 February 2026, a missile struck the Shajareh Tayyebeh elementary school in Minab, in southern Iran. Somewhere between a hundred and seventy and two hundred and sixty children were inside. Amnesty International concluded that U.S. forces were responsible, found a Tomahawk likely visible in footage of the wider attack on the adjoining compound, and stated expressly that it could not independently verify whether the school itself was struck by that same munition. That distinction is kept here because this book is about to ask other people to be careful with evidence. [7]</w:t>
       </w:r>
     </w:p>
     <w:p>
@@ -7979,15 +7978,15 @@
         <w:ind w:left="-5" w:right="15"/>
       </w:pPr>
       <w:r>
-        <w:t>One of the parents later described getting that call, being told his daughter had survived, and setting out to fetch her. The school was struck again before he arrived. Two Red Crescent medics and that parent gave this account to Middle East Eye. Minab’s mayor and the Iranian Ministry of Education state the school was struck three times in total. Satellite analysis by BBC Verify indicates the area was hit with multiple missiles. [7]</w:t>
-      </w:r>
-    </w:p>
-    <w:p>
-      <w:pPr>
-        <w:ind w:left="-5" w:right="15"/>
-      </w:pPr>
-      <w:r>
-        <w:t>A deliberately timed second strike intended to hit rescuers is often described as a double-tap attack; a further deliberately timed strike is sometimes called a triple tap. The distinction matters here. Public reporting supports that the school area was struck more than once, but the public evidence available while this edition was prepared does not establish that later impacts were deliberately timed to target rescuers. Sequence alone does not prove intent. [7]</w:t>
+        <w:t>One of the parents later described getting that call, being told his daughter had survived, and setting out to fetch her. The school was struck again before he arrived. Two Red Crescent medics and that parent gave this account to Middle East Eye. Minab’s mayor and the Iranian Ministry of Education state the school was struck three times in total. Satellite analysis by BBC Verify indicates the area was hit with multiple missiles. [8]</w:t>
+      </w:r>
+    </w:p>
+    <w:p>
+      <w:pPr>
+        <w:ind w:left="-5" w:right="15"/>
+      </w:pPr>
+      <w:r>
+        <w:t>A deliberately timed second strike intended to hit rescuers is often described as a double-tap attack; a further deliberately timed strike is sometimes called a triple tap. The distinction matters here. Public reporting supports that the school area was struck more than once, but the public evidence available while this edition was prepared does not establish that later impacts were deliberately timed to target rescuers. Sequence alone does not prove intent. [8]</w:t>
       </w:r>
     </w:p>
     <w:p>
@@ -8125,15 +8124,15 @@
         <w:ind w:left="-5" w:right="15"/>
       </w:pPr>
       <w:r>
-        <w:t>The counts are source-dependent and should not be merged into one number. Amnesty used an official total of a hundred and fifty-six dead including a hundred and twenty children. Airwars independently identified a hundred and fifty-seven dead, including a hundred and twenty-three children and thirty-four adults, and placed the possible total between a hundred and fifty-seven and a hundred and sixty-eight. Of the adults identified, twenty-six were school staff and five were parents. Many died in the second strike, in a prayer hall, waiting for the parents who had been telephoned. [7]</w:t>
-      </w:r>
-    </w:p>
-    <w:p>
-      <w:pPr>
-        <w:ind w:left="-5" w:right="15"/>
-      </w:pPr>
-      <w:r>
-        <w:t>Amnesty International concluded that U.S. forces were responsible and that the attack violated international humanitarian law because feasible precautions to protect civilians were not taken. Reporting on preliminary U.S. assessments has also pointed to outdated target intelligence as a possible cause. As of July 2026, however, the Pentagon had not publicly released a completed investigation, and Pentagon officials said the probe was still ongoing. [6]</w:t>
+        <w:t>The counts are source-dependent and should not be merged into one number. Amnesty used an official total of a hundred and fifty-six dead including a hundred and twenty children. Airwars independently identified a hundred and fifty-seven dead, including a hundred and twenty-three children and thirty-four adults, and placed the possible total between a hundred and fifty-seven and a hundred and sixty-eight. Of the adults identified, twenty-six were school staff and five were parents. Many died in the second strike, in a prayer hall, waiting for the parents who had been telephoned. [8]</w:t>
+      </w:r>
+    </w:p>
+    <w:p>
+      <w:pPr>
+        <w:ind w:left="-5" w:right="15"/>
+      </w:pPr>
+      <w:r>
+        <w:t>Amnesty International concluded that U.S. forces were responsible and that the attack violated international humanitarian law because feasible precautions to protect civilians were not taken. Reporting on preliminary U.S. assessments has also pointed to outdated target intelligence as a possible cause. As of July 2026, however, the Pentagon had not publicly released a completed investigation, and Pentagon officials said the probe was still ongoing. [7]</w:t>
       </w:r>
     </w:p>
     <w:p>
@@ -9332,7 +9331,7 @@
         <w:ind w:left="-5" w:right="15"/>
       </w:pPr>
       <w:r>
-        <w:t>Now look at what the ritual traditions did with the same idea, where it is not a reading at all but explicit. In the older Masonic degrees the candidate swore under stated penalties, and the penalties were performed as gestures: the thumb drawn across the throat, then across the chest, then across the abdomen, representing a throat cut, a breast torn open, and bowels removed. Older Latter-day Saint temple ceremonies used the same three gestures, in the same order, with the same thumb, until they were removed in 1990. [8]</w:t>
+        <w:t>Now look at what the ritual traditions did with the same idea, where it is not a reading at all but explicit. In the older Masonic degrees the candidate swore under stated penalties, and the penalties were performed as gestures: the thumb drawn across the throat, then across the chest, then across the abdomen, representing a throat cut, a breast torn open, and bowels removed. Older Latter-day Saint temple ceremonies used the same three gestures, in the same order, with the same thumb, until they were removed in 1990. [9]</w:t>
       </w:r>
     </w:p>
     <w:p>
@@ -11051,7 +11050,7 @@
         <w:ind w:left="-5" w:right="15"/>
       </w:pPr>
       <w:r>
-        <w:t>Together they show how the Scripture Engine actually runs. It does not require that the first author planned every later use. It does not require that the story be false. It does not require that every believer be captured the same way. A story turns into an operating instruction the moment people stop treating it as one account to be examined and start treating its structure as the natural shape of reality. [9]</w:t>
+        <w:t>Together they show how the Scripture Engine actually runs. It does not require that the first author planned every later use. It does not require that the story be false. It does not require that every believer be captured the same way. A story turns into an operating instruction the moment people stop treating it as one account to be examined and start treating its structure as the natural shape of reality. [11]</w:t>
       </w:r>
     </w:p>
     <w:p>
@@ -12322,7 +12321,7 @@
         <w:ind w:left="-5" w:right="15"/>
       </w:pPr>
       <w:r>
-        <w:t>A concrete case makes the difference visible. In 1096, tens of thousands of ordinary people walked out of their villages toward Jerusalem because they believed the end of the world was arriving and their souls depended on going. Traveling the same roads, under the same banner, using the same language, were nobles who came home with land, titles, and trade routes. Both groups were in the Crusade. Only one of them was executing the script. The other was steering the people who were. And at the time, from inside the column, the two were almost impossible to tell apart, which is precisely why the arrangement is so durable. The believers supply the momentum. The opportunists supply the direction. Neither group has to be aware of the other for the machine to run. [11]</w:t>
+        <w:t>A concrete case makes the difference visible. In 1096, tens of thousands of ordinary people walked out of their villages toward Jerusalem because they believed the end of the world was arriving and their souls depended on going. Traveling the same roads, under the same banner, using the same language, were nobles who came home with land, titles, and trade routes. Both groups were in the Crusade. Only one of them was executing the script. The other was steering the people who were. And at the time, from inside the column, the two were almost impossible to tell apart, which is precisely why the arrangement is so durable. The believers supply the momentum. The opportunists supply the direction. Neither group has to be aware of the other for the machine to run. [12]</w:t>
       </w:r>
     </w:p>
     <w:p>
@@ -12952,7 +12951,7 @@
         <w:ind w:left="-5" w:right="15"/>
       </w:pPr>
       <w:r>
-        <w:t>Counts vary, and the variation is not evasion, it is definitional. A base may mean a persistent operational installation. A site may mean a smaller facility, an access location, or a separate property record inside one installation. The Congressional Research Service, reporting in July 2024, identifies sixty-eight persistent overseas bases in its principal accounting while discussing other sites and access arrangements separately; broader Defense Department property inventories produce far larger numbers. [12]</w:t>
+        <w:t>Counts vary, and the variation is not evasion, it is definitional. A base may mean a persistent operational installation. A site may mean a smaller facility, an access location, or a separate property record inside one installation. The Congressional Research Service, reporting in July 2024, identifies sixty-eight persistent overseas bases in its principal accounting while discussing other sites and access arrangements separately; broader Defense Department property inventories produce far larger numbers. [13]</w:t>
       </w:r>
     </w:p>
     <w:p>
@@ -12968,7 +12967,7 @@
         <w:ind w:left="-5" w:right="15"/>
       </w:pPr>
       <w:r>
-        <w:t>Apply the Flip: what does a system that claims to protect actually do when the protected nation acts against the protector’s interests? Ask Iraq. Under the United Nations Oil-for-Food Programme it shifted the programme’s accounting from dollars to euros in November 2000. The invasion began in March 2003, under claims about weapons of mass destruction that were never found. [13]</w:t>
+        <w:t>Apply the Flip: what does a system that claims to protect actually do when the protected nation acts against the protector’s interests? Ask Iraq. Under the United Nations Oil-for-Food Programme it shifted the programme’s accounting from dollars to euros in November 2000. The invasion began in March 2003, under claims about weapons of mass destruction that were never found. [14]</w:t>
       </w:r>
     </w:p>
     <w:p>
@@ -13459,7 +13458,7 @@
         <w:ind w:left="-5" w:right="15"/>
       </w:pPr>
       <w:r>
-        <w:t>On August 15, 1971, Nixon announced that the United States would no longer convert dollars to gold at a fixed rate. Through the 1970s, American and Saudi security and investment arrangements funnelled oil revenues into dollardenominated assets, and oil stayed priced in dollars. Any nation that needed oil needed dollars. The dollar became not just a currency but the medium through which global energy flowed. The United States did not own the oil. It owned the channel. [14]</w:t>
+        <w:t>On August 15, 1971, Nixon announced that the United States would no longer convert dollars to gold at a fixed rate. Through the 1970s, American and Saudi security and investment arrangements funnelled oil revenues into dollardenominated assets, and oil stayed priced in dollars. Any nation that needed oil needed dollars. The dollar became not just a currency but the medium through which global energy flowed. The United States did not own the oil. It owned the channel. [15]</w:t>
       </w:r>
     </w:p>
     <w:p>
@@ -13714,15 +13713,15 @@
         <w:ind w:left="-5" w:right="15"/>
       </w:pPr>
       <w:r>
-        <w:t>Count the whole century and the number is enormous beyond argument. Estimates for twentieth-century war deaths run from around a hundred and ten million counting direct violence to well over two hundred million once warinduced famine and disease are included, and the two World Wars account for most of it. [15]</w:t>
-      </w:r>
-    </w:p>
-    <w:p>
-      <w:pPr>
-        <w:ind w:left="-5" w:right="15"/>
-      </w:pPr>
-      <w:r>
-        <w:t>Narrow it to the period since 1945, the era the winners named the long peace, and the honest answer becomes tens of millions, and the imprecision is the point. There is no agreed total. Different datasets count different conflicts, different date ranges, and different kinds of death, and the figure moves by tens of millions depending on whether you include the famines, the epidemics, and the collapsed infrastructure that follow a war and kill for a decade after the shooting stops. [15]</w:t>
+        <w:t>Count the whole century and the number is enormous beyond argument. Estimates for twentieth-century war deaths run from around a hundred and ten million counting direct violence to well over two hundred million once warinduced famine and disease are included, and the two World Wars account for most of it. [16]</w:t>
+      </w:r>
+    </w:p>
+    <w:p>
+      <w:pPr>
+        <w:ind w:left="-5" w:right="15"/>
+      </w:pPr>
+      <w:r>
+        <w:t>Narrow it to the period since 1945, the era the winners named the long peace, and the honest answer becomes tens of millions, and the imprecision is the point. There is no agreed total. Different datasets count different conflicts, different date ranges, and different kinds of death, and the figure moves by tens of millions depending on whether you include the famines, the epidemics, and the collapsed infrastructure that follow a war and kill for a decade after the shooting stops. [16]</w:t>
       </w:r>
     </w:p>
     <w:p>
@@ -13731,7 +13730,7 @@
         <w:ind w:left="-5" w:right="15"/>
       </w:pPr>
       <w:r>
-        <w:t>Sit with the asymmetry for a second. Militaries can track weapons and inventories with extraordinary precision, while estimates of war deaths can differ by millions because researchers are answering different questions: direct battle deaths, onesided violence, indirect deaths from hunger and disease, or all of those together. The uncertainty is real, but it is methodological rather than evidence that nobody bothered to count. [15]</w:t>
+        <w:t>Sit with the asymmetry for a second. Militaries can track weapons and inventories with extraordinary precision, while estimates of war deaths can differ by millions because researchers are answering different questions: direct battle deaths, onesided violence, indirect deaths from hunger and disease, or all of those together. The uncertainty is real, but it is methodological rather than evidence that nobody bothered to count. [16]</w:t>
       </w:r>
     </w:p>
     <w:p>
@@ -13911,7 +13910,7 @@
         <w:ind w:left="-5" w:right="15"/>
       </w:pPr>
       <w:r>
-        <w:t>The policy written afterward carries his name, and its first rule is the only rule that matters here. One animal, one name. Not a team. Not a shift. A person. The animal’s name goes on that person’s badge, worn where guests can see it. Responsibility never transfers by assumption: a handoff requires the receiving person to say out loud that they have accepted it, in writing, and until they do the original keeper still owns the animal. Never unassigned. Not for an hour. [16]</w:t>
+        <w:t>The policy written afterward carries his name, and its first rule is the only rule that matters here. One animal, one name. Not a team. Not a shift. A person. The animal’s name goes on that person’s badge, worn where guests can see it. Responsibility never transfers by assumption: a handoff requires the receiving person to say out loud that they have accepted it, in writing, and until they do the original keeper still owns the animal. Never unassigned. Not for an hour. [17]</w:t>
       </w:r>
     </w:p>
     <w:p>
@@ -13936,7 +13935,7 @@
         <w:ind w:left="-5" w:right="15"/>
       </w:pPr>
       <w:r>
-        <w:t>Now hold that next to Minab. Public reporting and Amnesty’s reconstruction raise the possibility that outdated information about a building once inside a military compound persisted after it had become a school. The completed U.S. investigation was not public when this edition was prepared, so the precise data path, review failures, and role of any automated system remain questions rather than established facts. [6]</w:t>
+        <w:t>Now hold that next to Minab. Public reporting and Amnesty’s reconstruction raise the possibility that outdated information about a building once inside a military compound persisted after it had become a school. The completed U.S. investigation was not public when this edition was prepared, so the precise data path, review failures, and role of any automated system remain questions rather than established facts. [7]</w:t>
       </w:r>
     </w:p>
     <w:p>
@@ -14743,7 +14742,7 @@
         <w:ind w:left="-5" w:right="15"/>
       </w:pPr>
       <w:r>
-        <w:t>The historian of that record, writing long after the events, put the whole thing in one line, and it is worth quoting exactly because it is one of the most concise statements of the mechanism in the text: the secret combinations did prove the overthrow, yea, almost the entire destruction of the people. [17]</w:t>
+        <w:t>The historian of that record, writing long after the events, put the whole thing in one line, and it is worth quoting exactly because it is one of the most concise statements of the mechanism in the text: the secret combinations did prove the overthrow, yea, almost the entire destruction of the people. [18]</w:t>
       </w:r>
     </w:p>
     <w:p>
@@ -14940,7 +14939,7 @@
         <w:ind w:left="-5" w:right="15"/>
       </w:pPr>
       <w:r>
-        <w:t>Psychologists call it confirmation bias, and it is not a character flaw. It is a property of the equipment, classically demonstrated by Peter Wason in 1960 and mapped comprehensively by Raymond Nickerson in a review that ran to nearly fifty pages in 1998. Nickerson’s definition is the seeking or interpreting of evidence in ways that are partial to existing beliefs, expectations, or a hypothesis already in hand, and what Wason found in his original experiments is that people struggled to test an idea by trying to break it, reaching instead for cases that would agree. Not because they were stupid or dishonest, but because a mind built for efficiency stops re-examining anything it has already filed as known. [18]</w:t>
+        <w:t>Psychologists call it confirmation bias, and it is not a character flaw. It is a property of the equipment, classically demonstrated by Peter Wason in 1960 and mapped comprehensively by Raymond Nickerson in a review that ran to nearly fifty pages in 1998. Nickerson’s definition is the seeking or interpreting of evidence in ways that are partial to existing beliefs, expectations, or a hypothesis already in hand, and what Wason found in his original experiments is that people struggled to test an idea by trying to break it, reaching instead for cases that would agree. Not because they were stupid or dishonest, but because a mind built for efficiency stops re-examining anything it has already filed as known. [19]</w:t>
       </w:r>
     </w:p>
     <w:p>
@@ -15299,7 +15298,7 @@
         <w:ind w:left="-5" w:right="15"/>
       </w:pPr>
       <w:r>
-        <w:t>Constantine defeated Maxentius in 312 and then disbanded the Praetorian Guard, destroyed its barracks, and dispersed its surviving members. His later construction of Constantinople shifted the imperial center farther from the Guard’s former seat, but that relocation was not the prior cause of the abolition. Mahmud II destroyed the Janissary corps in 1826. [19]</w:t>
+        <w:t>Constantine defeated Maxentius in 312 and then disbanded the Praetorian Guard, destroyed its barracks, and dispersed its surviving members. His later construction of Constantinople shifted the imperial center farther from the Guard’s former seat, but that relocation was not the prior cause of the abolition. Mahmud II destroyed the Janissary corps in 1826. [20]</w:t>
       </w:r>
     </w:p>
     <w:p>
@@ -16533,7 +16532,7 @@
         <w:ind w:left="-5" w:right="15"/>
       </w:pPr>
       <w:r>
-        <w:t>Venezuela should be among the richest nations in the world. It is not. [20]</w:t>
+        <w:t>Venezuela should be among the richest nations in the world. It is not. [21]</w:t>
       </w:r>
     </w:p>
     <w:p>
@@ -16542,7 +16541,7 @@
         <w:ind w:left="-5" w:right="15"/>
       </w:pPr>
       <w:r>
-        <w:t>Much of Venezuela’s crude is extra-heavy and requires diluent, specialized handling, maintained infrastructure, capital, technical expertise, and access to suitable refineries and buyers. U.S. sanctions constrained financing, trade, equipment, U.S. refining access, and at points the supply of needed diluent. But the production collapse was already being driven by underinvestment, management failures, loss of technical capacity, deteriorating infrastructure, and the wider economic crisis. Sanctions materially worsened a system that was already failing; they were neither irrelevant nor the single closed valve. [20]</w:t>
+        <w:t>Much of Venezuela’s crude is extra-heavy and requires diluent, specialized handling, maintained infrastructure, capital, technical expertise, and access to suitable refineries and buyers. U.S. sanctions constrained financing, trade, equipment, U.S. refining access, and at points the supply of needed diluent. But the production collapse was already being driven by underinvestment, management failures, loss of technical capacity, deteriorating infrastructure, and the wider economic crisis. Sanctions materially worsened a system that was already failing; they were neither irrelevant nor the single closed valve. [21]</w:t>
       </w:r>
     </w:p>
     <w:p>
@@ -16856,7 +16855,7 @@
         <w:t>yovel</w:t>
       </w:r>
       <w:r>
-        <w:t xml:space="preserve"> is associated with the ram’s horn sounded to announce it. Seven cycles of seven years, and then the fiftieth: a textual program of release and restoration, not a claim that every kind of ancient obligation vanished from every ledger. [21]</w:t>
+        <w:t xml:space="preserve"> is associated with the ram’s horn sounded to announce it. Seven cycles of seven years, and then the fiftieth: a textual program of release and restoration, not a claim that every kind of ancient obligation vanished from every ledger. [22]</w:t>
       </w:r>
     </w:p>
     <w:p>
@@ -17001,15 +17000,15 @@
           <w:i/>
           <w:color w:val="333333"/>
         </w:rPr>
-        <w:t>The reset can be read as maintenance as well as mercy. Compounding obligations can concentrate land, labor, and leverage faster than a social system can absorb indefinitely. Ancient law codes and royal clean-slate edicts show that some societies treated periodic release as one tool for restoring the balance. [21]</w:t>
-      </w:r>
-    </w:p>
-    <w:p>
-      <w:pPr>
-        <w:ind w:left="-5" w:right="15"/>
-      </w:pPr>
-      <w:r>
-        <w:t>And Israel was not the first society to imagine release. Mesopotamian rulers issued clean-slate edicts centuries before the biblical Jubilee texts, commonly remitting specified personal or agrarian obligations, restoring people or property, and releasing debt servitude. The Sumerian term amargi is associated with early written language of release or freedom and is conventionally glossed as a return to the mother, although the exact translation and scope deserve the caution given in the notes. [21]</w:t>
+        <w:t>The reset can be read as maintenance as well as mercy. Compounding obligations can concentrate land, labor, and leverage faster than a social system can absorb indefinitely. Ancient law codes and royal clean-slate edicts show that some societies treated periodic release as one tool for restoring the balance. [22]</w:t>
+      </w:r>
+    </w:p>
+    <w:p>
+      <w:pPr>
+        <w:ind w:left="-5" w:right="15"/>
+      </w:pPr>
+      <w:r>
+        <w:t>And Israel was not the first society to imagine release. Mesopotamian rulers issued clean-slate edicts centuries before the biblical Jubilee texts, commonly remitting specified personal or agrarian obligations, restoring people or property, and releasing debt servitude. The Sumerian term amargi is associated with early written language of release or freedom and is conventionally glossed as a return to the mother, although the exact translation and scope deserve the caution given in the notes. [22]</w:t>
       </w:r>
     </w:p>
     <w:p>
@@ -17064,13 +17063,8 @@
       <w:r>
         <w:t>At the London Debt Agreement of 1953, West Germany’s external debt was cut roughly in half and the remainder was placed on unusually favorable terms tied to the country’s capacity to earn foreign exchange. Research finds that the agreement materially improved fiscal space, borrowing conditions, investment, and price stability. It was one important contributor to West Germany’s recovery, alongside the 1948 currency reform, the European Payments Union, reconstruction, trade, institutions, and an economy that was already growing before 1953.</w:t>
       </w:r>
-    </w:p>
-    <w:p>
-      <w:pPr>
-        <w:ind w:left="-5" w:right="15"/>
-      </w:pPr>
-      <w:r>
-        <w:t>[22]</w:t>
+      <w:r>
+        <w:t xml:space="preserve"> [23]</w:t>
       </w:r>
     </w:p>
     <w:p>
@@ -18595,7 +18589,7 @@
         <w:ind w:left="-5" w:right="15"/>
       </w:pPr>
       <w:r>
-        <w:t>Asimov was not writing reassurance. He was writing, eighty years early, the one thing that is hardest to accept about rule-based safety: a sufficiently capable system following your rules will find the case you did not think of, and it will not be disobeying you when it does. [23]</w:t>
+        <w:t>Asimov was not writing reassurance. He was writing, eighty years early, the one thing that is hardest to accept about rule-based safety: a sufficiently capable system following your rules will find the case you did not think of, and it will not be disobeying you when it does. [25]</w:t>
       </w:r>
     </w:p>
     <w:p>
@@ -22659,15 +22653,24 @@
         <w:rPr>
           <w:b/>
         </w:rPr>
-        <w:t>Opening: The Sign</w:t>
-      </w:r>
-    </w:p>
-    <w:p>
-      <w:pPr>
-        <w:ind w:left="-5" w:right="15"/>
-      </w:pPr>
-      <w:r>
-        <w:t>Plato gives the accusation as corrupting the young and failing to recognize the gods recognized by the city while introducing new divine or spiritual things. Plato, Apology 24b–c. The restraining sign is discussed at Apology 31c–d, and the silence at the trial at Apology 40a–c. The biological reading offered here is the author’s retrospective synthesis; Plato’s text establishes Socrates’ report and his own interpretation of it, not a mitochondrial diagnosis. Perseus Digital Library, perseus.tufts.edu. HISTORICAL RECONSTRUCTION; AUTHOR’S SYNTHESIS.</w:t>
+        <w:t>1. Opening: God of the gaps</w:t>
+      </w:r>
+    </w:p>
+    <w:p>
+      <w:pPr>
+        <w:spacing w:after="0"/>
+        <w:ind w:left="-5" w:right="15"/>
+      </w:pPr>
+      <w:r>
+        <w:t>Henry Drummond used the image in his 1893 Lowell Lectures, published as The Ascent of Man (1894), writing of reverent minds who scan Nature and Science in search of gaps which they will fill up with God. Charles A. Coulson gave the phrase its permanent form in Science and Christian Belief (1955), observing that gaps of this sort have the unpreventable habit of shrinking. ESTABLISHED</w:t>
+      </w:r>
+    </w:p>
+    <w:p>
+      <w:pPr>
+        <w:ind w:left="-5" w:right="15"/>
+      </w:pPr>
+      <w:r>
+        <w:t>SOURCE.</w:t>
       </w:r>
     </w:p>
     <w:p>
@@ -22683,24 +22686,39 @@
         <w:rPr>
           <w:b/>
         </w:rPr>
-        <w:t>Opening: God of the gaps</w:t>
-      </w:r>
-    </w:p>
-    <w:p>
-      <w:pPr>
-        <w:spacing w:after="0"/>
-        <w:ind w:left="-5" w:right="15"/>
-      </w:pPr>
-      <w:r>
-        <w:t>Henry Drummond used the image in his 1893 Lowell Lectures, published as The Ascent of Man (1894), writing of reverent minds who scan Nature and Science in search of gaps which they will fill up with God. Charles A. Coulson gave the phrase its permanent form in Science and Christian Belief (1955), observing that gaps of this sort have the unpreventable habit of shrinking. ESTABLISHED</w:t>
-      </w:r>
-    </w:p>
-    <w:p>
-      <w:pPr>
-        <w:ind w:left="-5" w:right="15"/>
-      </w:pPr>
-      <w:r>
-        <w:t>SOURCE.</w:t>
+        <w:t>2. Opening: The Sign</w:t>
+      </w:r>
+    </w:p>
+    <w:p>
+      <w:pPr>
+        <w:ind w:left="-5" w:right="15"/>
+      </w:pPr>
+      <w:r>
+        <w:t>Plato gives the accusation as corrupting the young and failing to recognize the gods recognized by the city while introducing new divine or spiritual things. Plato, Apology 24b–c. The restraining sign is discussed at Apology 31c–d, and the silence at the trial at Apology 40a–c. The biological reading offered here is the author’s retrospective synthesis; Plato’s text establishes Socrates’ report and his own interpretation of it, not a mitochondrial diagnosis. Perseus Digital Library, perseus.tufts.edu. HISTORICAL RECONSTRUCTION; AUTHOR’S SYNTHESIS.</w:t>
+      </w:r>
+    </w:p>
+    <w:p>
+      <w:pPr>
+        <w:numPr>
+          <w:ilvl w:val="0"/>
+          <w:numId w:val="2"/>
+        </w:numPr>
+        <w:spacing w:after="142" w:line="259" w:lineRule="auto"/>
+        <w:ind w:hanging="290"/>
+      </w:pPr>
+      <w:r>
+        <w:rPr>
+          <w:b/>
+        </w:rPr>
+        <w:t>3. Chapter One: Alan Watts</w:t>
+      </w:r>
+    </w:p>
+    <w:p>
+      <w:pPr>
+        <w:ind w:left="-5" w:right="15"/>
+      </w:pPr>
+      <w:r>
+        <w:t>The distinction between a narrow, deliberate spotlight consciousness and a broad, ambient floodlight consciousness recurs across Watts’s lectures and writing. The observation that conscious attention is at the same time ignore-ance appears in The Book: On the Taboo Against Knowing Who You Are (1966). The phrasing here paraphrases rather than quotes. PARAPHRASE OF PUBLISHED SOURCE.</w:t>
       </w:r>
     </w:p>
     <w:p>
@@ -22716,7 +22734,7 @@
         <w:rPr>
           <w:b/>
         </w:rPr>
-        <w:t>Chapter Two: Musashi</w:t>
+        <w:t>4. Chapter Two: Musashi</w:t>
       </w:r>
     </w:p>
     <w:p>
@@ -22749,15 +22767,24 @@
         <w:rPr>
           <w:b/>
         </w:rPr>
-        <w:t>Chapter Three: Three Monkeys</w:t>
-      </w:r>
-    </w:p>
-    <w:p>
-      <w:pPr>
-        <w:ind w:left="-5" w:right="15"/>
-      </w:pPr>
-      <w:r>
-        <w:t>The maxim associated with Mizaru, Kikazaru, and Iwazaru is conventionally rendered see no evil, hear no evil, speak no evil, and has been connected with Kōshin traditions, moral discipline, avoidance, and later satirical meanings. The carving at Nikkō Tōshō-gū dates from the seventeenth century and is one of eight panels depicting the stages of a life. The negative suffix -zaru coincides with the combining form of saru, monkey, which is why the teaching acquired animals. The Japanese contains no word corresponding to evil; that term entered in translation. The three-stage verification sequence in this chapter is a deliberate modern reversal by the author, not a claim about original meaning. A. W. Smith, On the Ambiguity of the Three Wise Monkeys, Folklore 104, no. 1–2 (1993): 144– 150. DISPUTED INTERPRETATION; AUTHOR’S SYNTHESIS.</w:t>
+        <w:t>5. Chapter Three: spell and gospel</w:t>
+      </w:r>
+    </w:p>
+    <w:p>
+      <w:pPr>
+        <w:spacing w:after="0"/>
+        <w:ind w:left="-5" w:right="15"/>
+      </w:pPr>
+      <w:r>
+        <w:t>Old English spell meant a story, an account, or a spoken utterance, and survives in gospel, from gōd-spell, good tidings. The incantation sense descends from the same word. The sense meaning to name the letters of a word is a separate borrowing through Old French and is not related, so the popular claim that spelling and casting a spell are one act is not supported. Greek euangelion was in use for imperial proclamations before the New Testament writers adopted it; see the Priene Calendar Inscription (9 BC) for euangelion applied to Augustus.</w:t>
+      </w:r>
+    </w:p>
+    <w:p>
+      <w:pPr>
+        <w:ind w:left="-5" w:right="15"/>
+      </w:pPr>
+      <w:r>
+        <w:t>ESTABLISHED ETYMOLOGY; POPULAR VERSION CORRECTED.</w:t>
       </w:r>
     </w:p>
     <w:p>
@@ -22773,24 +22800,15 @@
         <w:rPr>
           <w:b/>
         </w:rPr>
-        <w:t>Chapter Three: spell and gospel</w:t>
-      </w:r>
-    </w:p>
-    <w:p>
-      <w:pPr>
-        <w:spacing w:after="0"/>
-        <w:ind w:left="-5" w:right="15"/>
-      </w:pPr>
-      <w:r>
-        <w:t>Old English spell meant a story, an account, or a spoken utterance, and survives in gospel, from gōd-spell, good tidings. The incantation sense descends from the same word. The sense meaning to name the letters of a word is a separate borrowing through Old French and is not related, so the popular claim that spelling and casting a spell are one act is not supported. Greek euangelion was in use for imperial proclamations before the New Testament writers adopted it.</w:t>
-      </w:r>
-    </w:p>
-    <w:p>
-      <w:pPr>
-        <w:ind w:left="-5" w:right="15"/>
-      </w:pPr>
-      <w:r>
-        <w:t>ESTABLISHED ETYMOLOGY; POPULAR VERSION CORRECTED.</w:t>
+        <w:t>6. Chapter Three: Three Monkeys</w:t>
+      </w:r>
+    </w:p>
+    <w:p>
+      <w:pPr>
+        <w:ind w:left="-5" w:right="15"/>
+      </w:pPr>
+      <w:r>
+        <w:t>The maxim associated with Mizaru, Kikazaru, and Iwazaru is conventionally rendered see no evil, hear no evil, speak no evil, and has been connected with Kōshin traditions, moral discipline, avoidance, and later satirical meanings. The carving at Nikkō Tōshō-gū dates from the seventeenth century and is one of eight panels depicting the stages of a life. The negative suffix -zaru coincides with the combining form of saru, monkey, which is why the teaching acquired animals. The Japanese contains no word corresponding to evil; that term entered in translation. The three-stage verification sequence in this chapter is a deliberate modern reversal by the author, not a claim about original meaning. A. W. Smith, On the Ambiguity of the Three Wise Monkeys, Folklore 104, no. 1–2 (1993): 144– 150. DISPUTED INTERPRETATION; AUTHOR’S SYNTHESIS.</w:t>
       </w:r>
     </w:p>
     <w:p>
@@ -22806,7 +22824,7 @@
         <w:rPr>
           <w:b/>
         </w:rPr>
-        <w:t>Chapter Four: Minab, responsibility</w:t>
+        <w:t>7. Chapter Four: Minab, responsibility</w:t>
       </w:r>
     </w:p>
     <w:p>
@@ -22830,7 +22848,7 @@
         <w:rPr>
           <w:b/>
         </w:rPr>
-        <w:t>Chapter Four: Minab, casualties</w:t>
+        <w:t>8. Chapter Four: Minab, casualties</w:t>
       </w:r>
     </w:p>
     <w:p>
@@ -22872,7 +22890,7 @@
         <w:rPr>
           <w:b/>
         </w:rPr>
-        <w:t>Chapter Five: penalty gestures</w:t>
+        <w:t>9. Chapter Five: penalty gestures</w:t>
       </w:r>
     </w:p>
     <w:p>
@@ -22905,15 +22923,15 @@
         <w:rPr>
           <w:b/>
         </w:rPr>
-        <w:t>Chapter Six: the four stories</w:t>
-      </w:r>
-    </w:p>
-    <w:p>
-      <w:pPr>
-        <w:ind w:left="-5" w:right="15"/>
-      </w:pPr>
-      <w:r>
-        <w:t>Genesis 6–9 (Noah), Genesis 41–47 (Joseph, with the sequence of money, livestock, and land at 47:13–26), Genesis 22 (the binding of Isaac). The structural readings offered here are the author’s, not established accounts of authorial intent. AUTHOR’S SYNTHESIS ON ESTABLISHED TEXTS.</w:t>
+        <w:t>10. Chapter Six: red words in their century</w:t>
+      </w:r>
+    </w:p>
+    <w:p>
+      <w:pPr>
+        <w:ind w:left="-5" w:right="15"/>
+      </w:pPr>
+      <w:r>
+        <w:t>The readings of the second mile, the right cheek, and the cloak follow Walter Wink, Engaging the Powers (1992) and The Powers That Be (1998), which argue these sayings describe a third option between submission and violent resistance. Widely taught and widely respected, but interpretations of first-century social practice rather than settled fact. DISPUTED INTERPRETATION.</w:t>
       </w:r>
     </w:p>
     <w:p>
@@ -22929,15 +22947,15 @@
         <w:rPr>
           <w:b/>
         </w:rPr>
-        <w:t>Chapter Six: red words in their century</w:t>
-      </w:r>
-    </w:p>
-    <w:p>
-      <w:pPr>
-        <w:ind w:left="-5" w:right="15"/>
-      </w:pPr>
-      <w:r>
-        <w:t>The readings of the second mile, the right cheek, and the cloak follow Walter Wink, Engaging the Powers (1992) and The Powers That Be (1998), which argue these sayings describe a third option between submission and violent resistance. Widely taught and widely respected, but interpretations of first-century social practice rather than settled fact. On imperial vocabulary, see the Priene Calendar Inscription (9 BC) for euangelion applied to Augustus. DISPUTED INTERPRETATION.</w:t>
+        <w:t>11. Chapter Six: the four stories</w:t>
+      </w:r>
+    </w:p>
+    <w:p>
+      <w:pPr>
+        <w:ind w:left="-5" w:right="15"/>
+      </w:pPr>
+      <w:r>
+        <w:t>Genesis 6–9 (Noah), Genesis 41–47 (Joseph, with the sequence of money, livestock, and land at 47:13–26), Genesis 22 (the binding of Isaac). The structural readings offered here are the author’s, not established accounts of authorial intent. AUTHOR’S SYNTHESIS ON ESTABLISHED TEXTS.</w:t>
       </w:r>
     </w:p>
     <w:p>
@@ -22953,7 +22971,7 @@
         <w:rPr>
           <w:b/>
         </w:rPr>
-        <w:t>Chapter Seven: the 1096 movements</w:t>
+        <w:t>12. Chapter Seven: the 1096 movements</w:t>
       </w:r>
     </w:p>
     <w:p>
@@ -22977,7 +22995,7 @@
         <w:rPr>
           <w:b/>
         </w:rPr>
-        <w:t>Chapter Eight: overseas military network</w:t>
+        <w:t>13. Chapter Eight: overseas military network</w:t>
       </w:r>
     </w:p>
     <w:p>
@@ -23001,7 +23019,7 @@
         <w:rPr>
           <w:b/>
         </w:rPr>
-        <w:t>Chapter Eight: Iraq and the euro</w:t>
+        <w:t>14. Chapter Eight: Iraq and the euro</w:t>
       </w:r>
     </w:p>
     <w:p>
@@ -23034,7 +23052,7 @@
         <w:rPr>
           <w:b/>
         </w:rPr>
-        <w:t>Chapter Eight: the dollar channel</w:t>
+        <w:t>15. Chapter Eight: the dollar channel</w:t>
       </w:r>
     </w:p>
     <w:p>
@@ -23058,7 +23076,7 @@
         <w:rPr>
           <w:b/>
         </w:rPr>
-        <w:t>Chapter Eight: post-1945 deaths</w:t>
+        <w:t>16. Chapter Eight: post-1945 deaths</w:t>
       </w:r>
     </w:p>
     <w:p>
@@ -23082,7 +23100,7 @@
         <w:rPr>
           <w:b/>
         </w:rPr>
-        <w:t>Chapter Eight: Loki Law</w:t>
+        <w:t>17. Chapter Eight: Loki Law</w:t>
       </w:r>
     </w:p>
     <w:p>
@@ -23106,7 +23124,7 @@
         <w:rPr>
           <w:b/>
         </w:rPr>
-        <w:t>Chapter Nine: Helaman</w:t>
+        <w:t>18. Chapter Nine: Helaman</w:t>
       </w:r>
     </w:p>
     <w:p>
@@ -23130,7 +23148,7 @@
         <w:rPr>
           <w:b/>
         </w:rPr>
-        <w:t>Chapter Nine: confirmation bias</w:t>
+        <w:t>19. Chapter Nine: confirmation bias</w:t>
       </w:r>
     </w:p>
     <w:p>
@@ -23163,7 +23181,7 @@
         <w:rPr>
           <w:b/>
         </w:rPr>
-        <w:t>Chapter Nine: Constantine and the Janissaries</w:t>
+        <w:t>20. Chapter Nine: Constantine and the Janissaries</w:t>
       </w:r>
     </w:p>
     <w:p>
@@ -23196,7 +23214,7 @@
         <w:rPr>
           <w:b/>
         </w:rPr>
-        <w:t>Chapter Ten: Venezuela</w:t>
+        <w:t>21. Chapter Ten: Venezuela</w:t>
       </w:r>
     </w:p>
     <w:p>
@@ -23220,7 +23238,7 @@
         <w:rPr>
           <w:b/>
         </w:rPr>
-        <w:t>Chapter Eleven: the Jubilee</w:t>
+        <w:t>22. Chapter Eleven: the Jubilee</w:t>
       </w:r>
     </w:p>
     <w:p>
@@ -23280,7 +23298,7 @@
         <w:rPr>
           <w:b/>
         </w:rPr>
-        <w:t>Chapter Eleven: London Debt Agreement</w:t>
+        <w:t>23. Chapter Eleven: London Debt Agreement</w:t>
       </w:r>
     </w:p>
     <w:p>
@@ -23313,15 +23331,15 @@
         <w:rPr>
           <w:b/>
         </w:rPr>
-        <w:t>Chapter Twelve: Asimov</w:t>
-      </w:r>
-    </w:p>
-    <w:p>
-      <w:pPr>
-        <w:ind w:left="-5" w:right="15"/>
-      </w:pPr>
-      <w:r>
-        <w:t>The robot stories collected as I, Robot were written between 1940 and 1950. The Three Laws are stated in Runaround (1942). Most of the stories turn on the Laws producing an unintended outcome while being followed exactly. ESTABLISHED PUBLICATION HISTORY.</w:t>
+        <w:t>24. Chapter Twelve: humanoid production targets</w:t>
+      </w:r>
+    </w:p>
+    <w:p>
+      <w:pPr>
+        <w:ind w:left="-5" w:right="15"/>
+      </w:pPr>
+      <w:r>
+        <w:t>Publicly stated manufacturing targets for general-purpose humanoid robots have been given in the millions of units annually, scaling year over year. Targets announced by manufacturers are projections, not deliveries, and should be read as statements of intent. MANUFACTURER PROJECTION; NOT AN ACHIEVED FIGURE.</w:t>
       </w:r>
     </w:p>
     <w:p>
@@ -23337,39 +23355,15 @@
         <w:rPr>
           <w:b/>
         </w:rPr>
-        <w:t>Chapter Twelve: humanoid production targets</w:t>
-      </w:r>
-    </w:p>
-    <w:p>
-      <w:pPr>
-        <w:ind w:left="-5" w:right="15"/>
-      </w:pPr>
-      <w:r>
-        <w:t>Publicly stated manufacturing targets for general-purpose humanoid robots have been given in the millions of units annually, scaling year over year. Targets announced by manufacturers are projections, not deliveries, and should be read as statements of intent. MANUFACTURER PROJECTION; NOT AN ACHIEVED FIGURE.</w:t>
-      </w:r>
-    </w:p>
-    <w:p>
-      <w:pPr>
-        <w:numPr>
-          <w:ilvl w:val="0"/>
-          <w:numId w:val="2"/>
-        </w:numPr>
-        <w:spacing w:after="142" w:line="259" w:lineRule="auto"/>
-        <w:ind w:hanging="290"/>
-      </w:pPr>
-      <w:r>
-        <w:rPr>
-          <w:b/>
-        </w:rPr>
-        <w:t>Chapter One: Alan Watts</w:t>
-      </w:r>
-    </w:p>
-    <w:p>
-      <w:pPr>
-        <w:ind w:left="-5" w:right="15"/>
-      </w:pPr>
-      <w:r>
-        <w:t>The distinction between a narrow, deliberate spotlight consciousness and a broad, ambient floodlight consciousness recurs across Watts’s lectures and writing. The observation that conscious attention is at the same time ignore-ance appears in The Book: On the Taboo Against Knowing Who You Are (1966). The phrasing here paraphrases rather than quotes. PARAPHRASE OF PUBLISHED SOURCE.</w:t>
+        <w:t>25. Chapter Twelve: Asimov</w:t>
+      </w:r>
+    </w:p>
+    <w:p>
+      <w:pPr>
+        <w:ind w:left="-5" w:right="15"/>
+      </w:pPr>
+      <w:r>
+        <w:t>The robot stories collected as I, Robot were written between 1940 and 1950. The Three Laws are stated in Runaround (1942). Most of the stories turn on the Laws producing an unintended outcome while being followed exactly. ESTABLISHED PUBLICATION HISTORY.</w:t>
       </w:r>
     </w:p>
     <w:p>

</xml_diff>

<commit_message>
Restore v2.0.1 to original upload (edits move to version-2.0.2)
</commit_message>
<xml_diff>
--- a/version-2.0.1/The_Hitchhikers_Guide_to_the_Homo_Sapiens_v2.0.1.docx
+++ b/version-2.0.1/The_Hitchhikers_Guide_to_the_Homo_Sapiens_v2.0.1.docx
@@ -61,7 +61,7 @@
         <w:ind w:left="-5" w:right="15"/>
       </w:pPr>
       <w:r>
-        <w:t>A.M. Covino</w:t>
+        <w:t>Ammon M. Covino</w:t>
       </w:r>
     </w:p>
     <w:p>
@@ -100,7 +100,7 @@
         <w:t xml:space="preserve">An Operating Manual for Life </w:t>
       </w:r>
       <w:r>
-        <w:t>Copyright © 2026 by A.M. Covino</w:t>
+        <w:t>Copyright © 2026 by Ammon M. Covino</w:t>
       </w:r>
     </w:p>
     <w:p>
@@ -985,7 +985,7 @@
         <w:ind w:left="-5" w:right="15"/>
       </w:pPr>
       <w:r>
-        <w:t>A.M. Covino</w:t>
+        <w:t>Ammon M. Covino</w:t>
       </w:r>
     </w:p>
     <w:p>
@@ -1245,12 +1245,6 @@
           <w:b/>
         </w:rPr>
         <w:t>Ch. 13 The Weld, Reuniting Mind and Heart</w:t>
-      </w:r>
-    </w:p>
-    <w:p>
-      <w:pPr/>
-      <w:r>
-        <w:t>Closing The Ten Rules. What Should Have Been Carved Instead</w:t>
       </w:r>
     </w:p>
     <w:p>
@@ -2276,15 +2270,16 @@
         <w:ind w:left="-5" w:right="15"/>
       </w:pPr>
       <w:r>
-        <w:t>In this book’s model, the interesting move is not replacing the word god with the word mitochondrion. It is moving from an external explanation to mechanisms that can be investigated, while admitting where the historical record no longer permits certainty. The Scottish evangelist Henry Drummond named this habit in his Lowell Lectures of 1893, and he was not attacking religion but defending it. There are reverent minds, he wrote, who ceaselessly scan the fields of Nature and the books of Science in search of gaps, gaps which they will fill up with God. As if God lived in gaps. [1]</w:t>
-      </w:r>
-    </w:p>
-    <w:p>
-      <w:pPr>
-        <w:ind w:left="-5" w:right="15"/>
-      </w:pPr>
-      <w:r>
-        <w:t>Sixty years later the chemist Charles Coulson gave the habit its permanent name and its obituary in the same sentence. There is no God of the gaps to take over at those strategic places where science fails, he wrote, and the reason is that gaps of this sort have the unpreventable habit of shrinking. [1]</w:t>
+        <w:t>In this book’s model, the interesting move is not replacing the word god with the word mitochondrion. It is moving from an external explanation to mechanisms that can be investigated, while admitting where the historical record no longer permits certainty. The Scottish evangelist Henry Drummond named this habit in his Lowell Lectures of 1893, and he was not attacking religion but defending it. There are reverent minds, he wrote, who ceaselessly scan the fields of Nature and the books of Science in search of gaps, gaps which they will fill up with God. As if God lived in gaps. [2]</w:t>
+      </w:r>
+    </w:p>
+    <w:p>
+      <w:pPr>
+        <w:ind w:left="-5" w:right="15"/>
+      </w:pPr>
+      <w:r>
+        <w:lastRenderedPageBreak/>
+        <w:t>Sixty years later the chemist Charles Coulson gave the habit its permanent name and its obituary in the same sentence. There is no God of the gaps to take over at those strategic places where science fails, he wrote, and the reason is that gaps of this sort have the unpreventable habit of shrinking. [2]</w:t>
       </w:r>
     </w:p>
     <w:p>
@@ -2321,7 +2316,7 @@
         <w:ind w:left="-5" w:right="15"/>
       </w:pPr>
       <w:r>
-        <w:t>The indictment, as Plato records it, was that Socrates was guilty of corrupting the young, and of not believing in the gods the city believed in, but in other new divinities. [2] Teaching people the wrong things, and causing a disruption. That is the charge. Everything else was commentary.</w:t>
+        <w:t>The indictment, as Plato records it, was that Socrates was guilty of corrupting the young, and of not believing in the gods the city believed in, but in other new divinities. [1] Teaching people the wrong things, and causing a disruption. That is the charge. Everything else was commentary.</w:t>
       </w:r>
     </w:p>
     <w:p>
@@ -4888,15 +4883,15 @@
         <w:ind w:left="-5" w:right="15"/>
       </w:pPr>
       <w:r>
-        <w:t>Alan Watts spent his career pointing at something most people feel and cannot name. We have two kinds of consciousness, he said, and we are trained from childhood to identify with only one of them. The first he called the spotlight: narrow, deliberate, the beam you aim at whatever you have decided matters. The second he called the floodlight: broad, constant, running underneath, taking in the road and the traffic and the room while the spotlight is busy elsewhere. [3]</w:t>
-      </w:r>
-    </w:p>
-    <w:p>
-      <w:pPr>
-        <w:ind w:left="-5" w:right="15"/>
-      </w:pPr>
-      <w:r>
-        <w:t>The price of specializing in the spotlight, he wrote, is ignorance of everything outside its field, and he liked to break the word open when he said it, because what it actually describes is not stupidity but a decision. Conscious attention, in his phrase, is at the same time ignore-ance. [3]</w:t>
+        <w:t>Alan Watts spent his career pointing at something most people feel and cannot name. We have two kinds of consciousness, he said, and we are trained from childhood to identify with only one of them. The first he called the spotlight: narrow, deliberate, the beam you aim at whatever you have decided matters. The second he called the floodlight: broad, constant, running underneath, taking in the road and the traffic and the room while the spotlight is busy elsewhere. [25]</w:t>
+      </w:r>
+    </w:p>
+    <w:p>
+      <w:pPr>
+        <w:ind w:left="-5" w:right="15"/>
+      </w:pPr>
+      <w:r>
+        <w:t>The price of specializing in the spotlight, he wrote, is ignorance of everything outside its field, and he liked to break the word open when he said it, because what it actually describes is not stupidity but a decision. Conscious attention, in his phrase, is at the same time ignore-ance. [25]</w:t>
       </w:r>
     </w:p>
     <w:p>
@@ -5283,7 +5278,7 @@
         <w:ind w:left="-5" w:right="15"/>
       </w:pPr>
       <w:r>
-        <w:t>Miyamoto Musashi was a real seventeenth-century swordsman, and his duel with Sasaki Kojirō is part of the historical record. The version almost everyone knows, however, was polished by later retelling. The theatrical lateness, the oar carved during the crossing, its exact length, the discarded scabbard, and the precise psychological sequence are not details this book can present as if a neutral witness wrote them down that morning. [4]</w:t>
+        <w:t>Miyamoto Musashi was a real seventeenth-century swordsman, and his duel with Sasaki Kojirō is part of the historical record. The version almost everyone knows, however, was polished by later retelling. The theatrical lateness, the oar carved during the crossing, its exact length, the discarded scabbard, and the precise psychological sequence are not details this book can present as if a neutral witness wrote them down that morning. [3]</w:t>
       </w:r>
     </w:p>
     <w:p>
@@ -6736,7 +6731,7 @@
         <w:ind w:left="-5" w:right="15"/>
       </w:pPr>
       <w:r>
-        <w:t>So when a handful of provincials under military occupation began circulating an euangelion about an executed laborer, they were not choosing devotional language. They were taking the word the empire used for its own proclamations and putting a crucified man in it, which everyone hearing it in that century would have understood immediately as an act of substitution. [5]</w:t>
+        <w:t>So when a handful of provincials under military occupation began circulating an euangelion about an executed laborer, they were not choosing devotional language. They were taking the word the empire used for its own proclamations and putting a crucified man in it, which everyone hearing it in that century would have understood immediately as an act of substitution. [10]</w:t>
       </w:r>
     </w:p>
     <w:p>
@@ -6921,23 +6916,23 @@
         <w:ind w:left="-5" w:right="15"/>
       </w:pPr>
       <w:r>
-        <w:t>Almost everyone knows the image: three monkeys, one covering its eyes, one covering its ears, one covering its mouth. The popular English reading is often “see no evil, hear no evil, speak no evil,” but the image has carried multiple meanings across time and place. What follows is not a recovered original code hidden inside the carving. It is this book’s deliberate modern repurposing of it. [6]</w:t>
-      </w:r>
-    </w:p>
-    <w:p>
-      <w:pPr>
-        <w:ind w:left="-5" w:right="15"/>
-      </w:pPr>
-      <w:r>
-        <w:t>The carving everyone knows sits at Tōshō-gū in Nikkō, Japan, from the seventeenth century, as one panel in a larger sequence. The underlying maxim has older Chinese and Japanese associations with moral discipline, restraint, avoidance, and propriety; later uses have ranged all the way to satire. [6]</w:t>
-      </w:r>
-    </w:p>
-    <w:p>
-      <w:pPr>
-        <w:ind w:left="-5" w:right="15"/>
-      </w:pPr>
-      <w:r>
-        <w:t>In Japanese the familiar phrase is mizaru, kikazaru, iwazaru: see not, hear not, speak not. The negative ending -zaru also permits the monkey wordplay that gave the maxim its three animals. The Japanese phrase itself does not contain a separate word corresponding to the English “evil.” [6]</w:t>
+        <w:t>Almost everyone knows the image: three monkeys, one covering its eyes, one covering its ears, one covering its mouth. The popular English reading is often “see no evil, hear no evil, speak no evil,” but the image has carried multiple meanings across time and place. What follows is not a recovered original code hidden inside the carving. It is this book’s deliberate modern repurposing of it. [4]</w:t>
+      </w:r>
+    </w:p>
+    <w:p>
+      <w:pPr>
+        <w:ind w:left="-5" w:right="15"/>
+      </w:pPr>
+      <w:r>
+        <w:t>The carving everyone knows sits at Tōshō-gū in Nikkō, Japan, from the seventeenth century, as one panel in a larger sequence. The underlying maxim has older Chinese and Japanese associations with moral discipline, restraint, avoidance, and propriety; later uses have ranged all the way to satire. [4]</w:t>
+      </w:r>
+    </w:p>
+    <w:p>
+      <w:pPr>
+        <w:ind w:left="-5" w:right="15"/>
+      </w:pPr>
+      <w:r>
+        <w:t>In Japanese the familiar phrase is mizaru, kikazaru, iwazaru: see not, hear not, speak not. The negative ending -zaru also permits the monkey wordplay that gave the maxim its three animals. The Japanese phrase itself does not contain a separate word corresponding to the English “evil.” [4]</w:t>
       </w:r>
     </w:p>
     <w:p>
@@ -7946,7 +7941,7 @@
         <w:ind w:left="-5" w:right="15"/>
       </w:pPr>
       <w:r>
-        <w:t>On the morning of 28 February 2026, a missile struck the Shajareh Tayyebeh elementary school in Minab, in southern Iran. Somewhere between a hundred and seventy and two hundred and sixty children were inside. Amnesty International concluded that U.S. forces were responsible, found a Tomahawk likely visible in footage of the wider attack on the adjoining compound, and stated expressly that it could not independently verify whether the school itself was struck by that same munition. That distinction is kept here because this book is about to ask other people to be careful with evidence. [7]</w:t>
+        <w:t>On the morning of 28 February 2026, a missile struck the Shajareh Tayyebeh elementary school in Minab, in southern Iran. Somewhere between a hundred and seventy and two hundred and sixty children were inside. Amnesty International concluded that U.S. forces were responsible, found a Tomahawk likely visible in footage of the wider attack on the adjoining compound, and stated expressly that it could not independently verify whether the school itself was struck by that same munition. That distinction is kept here because this book is about to ask other people to be careful with evidence. [6]</w:t>
       </w:r>
     </w:p>
     <w:p>
@@ -7978,15 +7973,15 @@
         <w:ind w:left="-5" w:right="15"/>
       </w:pPr>
       <w:r>
-        <w:t>One of the parents later described getting that call, being told his daughter had survived, and setting out to fetch her. The school was struck again before he arrived. Two Red Crescent medics and that parent gave this account to Middle East Eye. Minab’s mayor and the Iranian Ministry of Education state the school was struck three times in total. Satellite analysis by BBC Verify indicates the area was hit with multiple missiles. [8]</w:t>
-      </w:r>
-    </w:p>
-    <w:p>
-      <w:pPr>
-        <w:ind w:left="-5" w:right="15"/>
-      </w:pPr>
-      <w:r>
-        <w:t>A deliberately timed second strike intended to hit rescuers is often described as a double-tap attack; a further deliberately timed strike is sometimes called a triple tap. The distinction matters here. Public reporting supports that the school area was struck more than once, but the public evidence available while this edition was prepared does not establish that later impacts were deliberately timed to target rescuers. Sequence alone does not prove intent. [8]</w:t>
+        <w:t>One of the parents later described getting that call, being told his daughter had survived, and setting out to fetch her. The school was struck again before he arrived. Two Red Crescent medics and that parent gave this account to Middle East Eye. Minab’s mayor and the Iranian Ministry of Education state the school was struck three times in total. Satellite analysis by BBC Verify indicates the area was hit with multiple missiles. [7]</w:t>
+      </w:r>
+    </w:p>
+    <w:p>
+      <w:pPr>
+        <w:ind w:left="-5" w:right="15"/>
+      </w:pPr>
+      <w:r>
+        <w:t>A deliberately timed second strike intended to hit rescuers is often described as a double-tap attack; a further deliberately timed strike is sometimes called a triple tap. The distinction matters here. Public reporting supports that the school area was struck more than once, but the public evidence available while this edition was prepared does not establish that later impacts were deliberately timed to target rescuers. Sequence alone does not prove intent. [7]</w:t>
       </w:r>
     </w:p>
     <w:p>
@@ -8124,15 +8119,15 @@
         <w:ind w:left="-5" w:right="15"/>
       </w:pPr>
       <w:r>
-        <w:t>The counts are source-dependent and should not be merged into one number. Amnesty used an official total of a hundred and fifty-six dead including a hundred and twenty children. Airwars independently identified a hundred and fifty-seven dead, including a hundred and twenty-three children and thirty-four adults, and placed the possible total between a hundred and fifty-seven and a hundred and sixty-eight. Of the adults identified, twenty-six were school staff and five were parents. Many died in the second strike, in a prayer hall, waiting for the parents who had been telephoned. [8]</w:t>
-      </w:r>
-    </w:p>
-    <w:p>
-      <w:pPr>
-        <w:ind w:left="-5" w:right="15"/>
-      </w:pPr>
-      <w:r>
-        <w:t>Amnesty International concluded that U.S. forces were responsible and that the attack violated international humanitarian law because feasible precautions to protect civilians were not taken. Reporting on preliminary U.S. assessments has also pointed to outdated target intelligence as a possible cause. As of July 2026, however, the Pentagon had not publicly released a completed investigation, and Pentagon officials said the probe was still ongoing. [7]</w:t>
+        <w:t>The counts are source-dependent and should not be merged into one number. Amnesty used an official total of a hundred and fifty-six dead including a hundred and twenty children. Airwars independently identified a hundred and fifty-seven dead, including a hundred and twenty-three children and thirty-four adults, and placed the possible total between a hundred and fifty-seven and a hundred and sixty-eight. Of the adults identified, twenty-six were school staff and five were parents. Many died in the second strike, in a prayer hall, waiting for the parents who had been telephoned. [7]</w:t>
+      </w:r>
+    </w:p>
+    <w:p>
+      <w:pPr>
+        <w:ind w:left="-5" w:right="15"/>
+      </w:pPr>
+      <w:r>
+        <w:t>Amnesty International concluded that U.S. forces were responsible and that the attack violated international humanitarian law because feasible precautions to protect civilians were not taken. Reporting on preliminary U.S. assessments has also pointed to outdated target intelligence as a possible cause. As of July 2026, however, the Pentagon had not publicly released a completed investigation, and Pentagon officials said the probe was still ongoing. [6]</w:t>
       </w:r>
     </w:p>
     <w:p>
@@ -9331,7 +9326,7 @@
         <w:ind w:left="-5" w:right="15"/>
       </w:pPr>
       <w:r>
-        <w:t>Now look at what the ritual traditions did with the same idea, where it is not a reading at all but explicit. In the older Masonic degrees the candidate swore under stated penalties, and the penalties were performed as gestures: the thumb drawn across the throat, then across the chest, then across the abdomen, representing a throat cut, a breast torn open, and bowels removed. Older Latter-day Saint temple ceremonies used the same three gestures, in the same order, with the same thumb, until they were removed in 1990. [9]</w:t>
+        <w:t>Now look at what the ritual traditions did with the same idea, where it is not a reading at all but explicit. In the older Masonic degrees the candidate swore under stated penalties, and the penalties were performed as gestures: the thumb drawn across the throat, then across the chest, then across the abdomen, representing a throat cut, a breast torn open, and bowels removed. Older Latter-day Saint temple ceremonies used the same three gestures, in the same order, with the same thumb, until they were removed in 1990. [8]</w:t>
       </w:r>
     </w:p>
     <w:p>
@@ -11050,7 +11045,7 @@
         <w:ind w:left="-5" w:right="15"/>
       </w:pPr>
       <w:r>
-        <w:t>Together they show how the Scripture Engine actually runs. It does not require that the first author planned every later use. It does not require that the story be false. It does not require that every believer be captured the same way. A story turns into an operating instruction the moment people stop treating it as one account to be examined and start treating its structure as the natural shape of reality. [11]</w:t>
+        <w:t>Together they show how the Scripture Engine actually runs. It does not require that the first author planned every later use. It does not require that the story be false. It does not require that every believer be captured the same way. A story turns into an operating instruction the moment people stop treating it as one account to be examined and start treating its structure as the natural shape of reality. [9]</w:t>
       </w:r>
     </w:p>
     <w:p>
@@ -12321,7 +12316,7 @@
         <w:ind w:left="-5" w:right="15"/>
       </w:pPr>
       <w:r>
-        <w:t>A concrete case makes the difference visible. In 1096, tens of thousands of ordinary people walked out of their villages toward Jerusalem because they believed the end of the world was arriving and their souls depended on going. Traveling the same roads, under the same banner, using the same language, were nobles who came home with land, titles, and trade routes. Both groups were in the Crusade. Only one of them was executing the script. The other was steering the people who were. And at the time, from inside the column, the two were almost impossible to tell apart, which is precisely why the arrangement is so durable. The believers supply the momentum. The opportunists supply the direction. Neither group has to be aware of the other for the machine to run. [12]</w:t>
+        <w:t>A concrete case makes the difference visible. In 1096, tens of thousands of ordinary people walked out of their villages toward Jerusalem because they believed the end of the world was arriving and their souls depended on going. Traveling the same roads, under the same banner, using the same language, were nobles who came home with land, titles, and trade routes. Both groups were in the Crusade. Only one of them was executing the script. The other was steering the people who were. And at the time, from inside the column, the two were almost impossible to tell apart, which is precisely why the arrangement is so durable. The believers supply the momentum. The opportunists supply the direction. Neither group has to be aware of the other for the machine to run. [11]</w:t>
       </w:r>
     </w:p>
     <w:p>
@@ -12951,7 +12946,7 @@
         <w:ind w:left="-5" w:right="15"/>
       </w:pPr>
       <w:r>
-        <w:t>Counts vary, and the variation is not evasion, it is definitional. A base may mean a persistent operational installation. A site may mean a smaller facility, an access location, or a separate property record inside one installation. The Congressional Research Service, reporting in July 2024, identifies sixty-eight persistent overseas bases in its principal accounting while discussing other sites and access arrangements separately; broader Defense Department property inventories produce far larger numbers. [13]</w:t>
+        <w:t>Counts vary, and the variation is not evasion, it is definitional. A base may mean a persistent operational installation. A site may mean a smaller facility, an access location, or a separate property record inside one installation. The Congressional Research Service, reporting in July 2024, identifies sixty-eight persistent overseas bases in its principal accounting while discussing other sites and access arrangements separately; broader Defense Department property inventories produce far larger numbers. [12]</w:t>
       </w:r>
     </w:p>
     <w:p>
@@ -12967,7 +12962,7 @@
         <w:ind w:left="-5" w:right="15"/>
       </w:pPr>
       <w:r>
-        <w:t>Apply the Flip: what does a system that claims to protect actually do when the protected nation acts against the protector’s interests? Ask Iraq. Under the United Nations Oil-for-Food Programme it shifted the programme’s accounting from dollars to euros in November 2000. The invasion began in March 2003, under claims about weapons of mass destruction that were never found. [14]</w:t>
+        <w:t>Apply the Flip: what does a system that claims to protect actually do when the protected nation acts against the protector’s interests? Ask Iraq. Under the United Nations Oil-for-Food Programme it shifted the programme’s accounting from dollars to euros in November 2000. The invasion began in March 2003, under claims about weapons of mass destruction that were never found. [13]</w:t>
       </w:r>
     </w:p>
     <w:p>
@@ -13458,7 +13453,7 @@
         <w:ind w:left="-5" w:right="15"/>
       </w:pPr>
       <w:r>
-        <w:t>On August 15, 1971, Nixon announced that the United States would no longer convert dollars to gold at a fixed rate. Through the 1970s, American and Saudi security and investment arrangements funnelled oil revenues into dollardenominated assets, and oil stayed priced in dollars. Any nation that needed oil needed dollars. The dollar became not just a currency but the medium through which global energy flowed. The United States did not own the oil. It owned the channel. [15]</w:t>
+        <w:t>On August 15, 1971, Nixon announced that the United States would no longer convert dollars to gold at a fixed rate. Through the 1970s, American and Saudi security and investment arrangements funnelled oil revenues into dollardenominated assets, and oil stayed priced in dollars. Any nation that needed oil needed dollars. The dollar became not just a currency but the medium through which global energy flowed. The United States did not own the oil. It owned the channel. [14]</w:t>
       </w:r>
     </w:p>
     <w:p>
@@ -13713,15 +13708,15 @@
         <w:ind w:left="-5" w:right="15"/>
       </w:pPr>
       <w:r>
-        <w:t>Count the whole century and the number is enormous beyond argument. Estimates for twentieth-century war deaths run from around a hundred and ten million counting direct violence to well over two hundred million once warinduced famine and disease are included, and the two World Wars account for most of it. [16]</w:t>
-      </w:r>
-    </w:p>
-    <w:p>
-      <w:pPr>
-        <w:ind w:left="-5" w:right="15"/>
-      </w:pPr>
-      <w:r>
-        <w:t>Narrow it to the period since 1945, the era the winners named the long peace, and the honest answer becomes tens of millions, and the imprecision is the point. There is no agreed total. Different datasets count different conflicts, different date ranges, and different kinds of death, and the figure moves by tens of millions depending on whether you include the famines, the epidemics, and the collapsed infrastructure that follow a war and kill for a decade after the shooting stops. [16]</w:t>
+        <w:t>Count the whole century and the number is enormous beyond argument. Estimates for twentieth-century war deaths run from around a hundred and ten million counting direct violence to well over two hundred million once warinduced famine and disease are included, and the two World Wars account for most of it. [15]</w:t>
+      </w:r>
+    </w:p>
+    <w:p>
+      <w:pPr>
+        <w:ind w:left="-5" w:right="15"/>
+      </w:pPr>
+      <w:r>
+        <w:t>Narrow it to the period since 1945, the era the winners named the long peace, and the honest answer becomes tens of millions, and the imprecision is the point. There is no agreed total. Different datasets count different conflicts, different date ranges, and different kinds of death, and the figure moves by tens of millions depending on whether you include the famines, the epidemics, and the collapsed infrastructure that follow a war and kill for a decade after the shooting stops. [15]</w:t>
       </w:r>
     </w:p>
     <w:p>
@@ -13730,7 +13725,7 @@
         <w:ind w:left="-5" w:right="15"/>
       </w:pPr>
       <w:r>
-        <w:t>Sit with the asymmetry for a second. Militaries can track weapons and inventories with extraordinary precision, while estimates of war deaths can differ by millions because researchers are answering different questions: direct battle deaths, onesided violence, indirect deaths from hunger and disease, or all of those together. The uncertainty is real, but it is methodological rather than evidence that nobody bothered to count. [16]</w:t>
+        <w:t>Sit with the asymmetry for a second. Militaries can track weapons and inventories with extraordinary precision, while estimates of war deaths can differ by millions because researchers are answering different questions: direct battle deaths, onesided violence, indirect deaths from hunger and disease, or all of those together. The uncertainty is real, but it is methodological rather than evidence that nobody bothered to count. [15]</w:t>
       </w:r>
     </w:p>
     <w:p>
@@ -13910,7 +13905,7 @@
         <w:ind w:left="-5" w:right="15"/>
       </w:pPr>
       <w:r>
-        <w:t>The policy written afterward carries his name, and its first rule is the only rule that matters here. One animal, one name. Not a team. Not a shift. A person. The animal’s name goes on that person’s badge, worn where guests can see it. Responsibility never transfers by assumption: a handoff requires the receiving person to say out loud that they have accepted it, in writing, and until they do the original keeper still owns the animal. Never unassigned. Not for an hour. [17]</w:t>
+        <w:t>The policy written afterward carries his name, and its first rule is the only rule that matters here. One animal, one name. Not a team. Not a shift. A person. The animal’s name goes on that person’s badge, worn where guests can see it. Responsibility never transfers by assumption: a handoff requires the receiving person to say out loud that they have accepted it, in writing, and until they do the original keeper still owns the animal. Never unassigned. Not for an hour. [16]</w:t>
       </w:r>
     </w:p>
     <w:p>
@@ -13935,7 +13930,7 @@
         <w:ind w:left="-5" w:right="15"/>
       </w:pPr>
       <w:r>
-        <w:t>Now hold that next to Minab. Public reporting and Amnesty’s reconstruction raise the possibility that outdated information about a building once inside a military compound persisted after it had become a school. The completed U.S. investigation was not public when this edition was prepared, so the precise data path, review failures, and role of any automated system remain questions rather than established facts. [7]</w:t>
+        <w:t>Now hold that next to Minab. Public reporting and Amnesty’s reconstruction raise the possibility that outdated information about a building once inside a military compound persisted after it had become a school. The completed U.S. investigation was not public when this edition was prepared, so the precise data path, review failures, and role of any automated system remain questions rather than established facts. [6]</w:t>
       </w:r>
     </w:p>
     <w:p>
@@ -14742,7 +14737,7 @@
         <w:ind w:left="-5" w:right="15"/>
       </w:pPr>
       <w:r>
-        <w:t>The historian of that record, writing long after the events, put the whole thing in one line, and it is worth quoting exactly because it is one of the most concise statements of the mechanism in the text: the secret combinations did prove the overthrow, yea, almost the entire destruction of the people. [18]</w:t>
+        <w:t>The historian of that record, writing long after the events, put the whole thing in one line, and it is worth quoting exactly because it is one of the most concise statements of the mechanism in the text: the secret combinations did prove the overthrow, yea, almost the entire destruction of the people. [17]</w:t>
       </w:r>
     </w:p>
     <w:p>
@@ -14939,7 +14934,7 @@
         <w:ind w:left="-5" w:right="15"/>
       </w:pPr>
       <w:r>
-        <w:t>Psychologists call it confirmation bias, and it is not a character flaw. It is a property of the equipment, classically demonstrated by Peter Wason in 1960 and mapped comprehensively by Raymond Nickerson in a review that ran to nearly fifty pages in 1998. Nickerson’s definition is the seeking or interpreting of evidence in ways that are partial to existing beliefs, expectations, or a hypothesis already in hand, and what Wason found in his original experiments is that people struggled to test an idea by trying to break it, reaching instead for cases that would agree. Not because they were stupid or dishonest, but because a mind built for efficiency stops re-examining anything it has already filed as known. [19]</w:t>
+        <w:t>Psychologists call it confirmation bias, and it is not a character flaw. It is a property of the equipment, classically demonstrated by Peter Wason in 1960 and mapped comprehensively by Raymond Nickerson in a review that ran to nearly fifty pages in 1998. Nickerson’s definition is the seeking or interpreting of evidence in ways that are partial to existing beliefs, expectations, or a hypothesis already in hand, and what Wason found in his original experiments is that people struggled to test an idea by trying to break it, reaching instead for cases that would agree. Not because they were stupid or dishonest, but because a mind built for efficiency stops re-examining anything it has already filed as known. [18]</w:t>
       </w:r>
     </w:p>
     <w:p>
@@ -15298,7 +15293,7 @@
         <w:ind w:left="-5" w:right="15"/>
       </w:pPr>
       <w:r>
-        <w:t>Constantine defeated Maxentius in 312 and then disbanded the Praetorian Guard, destroyed its barracks, and dispersed its surviving members. His later construction of Constantinople shifted the imperial center farther from the Guard’s former seat, but that relocation was not the prior cause of the abolition. Mahmud II destroyed the Janissary corps in 1826. [20]</w:t>
+        <w:t>Constantine defeated Maxentius in 312 and then disbanded the Praetorian Guard, destroyed its barracks, and dispersed its surviving members. His later construction of Constantinople shifted the imperial center farther from the Guard’s former seat, but that relocation was not the prior cause of the abolition. Mahmud II destroyed the Janissary corps in 1826. [19]</w:t>
       </w:r>
     </w:p>
     <w:p>
@@ -16532,7 +16527,7 @@
         <w:ind w:left="-5" w:right="15"/>
       </w:pPr>
       <w:r>
-        <w:t>Venezuela should be among the richest nations in the world. It is not. [21]</w:t>
+        <w:t>Venezuela should be among the richest nations in the world. It is not. [20]</w:t>
       </w:r>
     </w:p>
     <w:p>
@@ -16541,7 +16536,7 @@
         <w:ind w:left="-5" w:right="15"/>
       </w:pPr>
       <w:r>
-        <w:t>Much of Venezuela’s crude is extra-heavy and requires diluent, specialized handling, maintained infrastructure, capital, technical expertise, and access to suitable refineries and buyers. U.S. sanctions constrained financing, trade, equipment, U.S. refining access, and at points the supply of needed diluent. But the production collapse was already being driven by underinvestment, management failures, loss of technical capacity, deteriorating infrastructure, and the wider economic crisis. Sanctions materially worsened a system that was already failing; they were neither irrelevant nor the single closed valve. [21]</w:t>
+        <w:t>Much of Venezuela’s crude is extra-heavy and requires diluent, specialized handling, maintained infrastructure, capital, technical expertise, and access to suitable refineries and buyers. U.S. sanctions constrained financing, trade, equipment, U.S. refining access, and at points the supply of needed diluent. But the production collapse was already being driven by underinvestment, management failures, loss of technical capacity, deteriorating infrastructure, and the wider economic crisis. Sanctions materially worsened a system that was already failing; they were neither irrelevant nor the single closed valve. [20]</w:t>
       </w:r>
     </w:p>
     <w:p>
@@ -16855,7 +16850,7 @@
         <w:t>yovel</w:t>
       </w:r>
       <w:r>
-        <w:t xml:space="preserve"> is associated with the ram’s horn sounded to announce it. Seven cycles of seven years, and then the fiftieth: a textual program of release and restoration, not a claim that every kind of ancient obligation vanished from every ledger. [22]</w:t>
+        <w:t xml:space="preserve"> is associated with the ram’s horn sounded to announce it. Seven cycles of seven years, and then the fiftieth: a textual program of release and restoration, not a claim that every kind of ancient obligation vanished from every ledger. [21]</w:t>
       </w:r>
     </w:p>
     <w:p>
@@ -17000,15 +16995,15 @@
           <w:i/>
           <w:color w:val="333333"/>
         </w:rPr>
-        <w:t>The reset can be read as maintenance as well as mercy. Compounding obligations can concentrate land, labor, and leverage faster than a social system can absorb indefinitely. Ancient law codes and royal clean-slate edicts show that some societies treated periodic release as one tool for restoring the balance. [22]</w:t>
-      </w:r>
-    </w:p>
-    <w:p>
-      <w:pPr>
-        <w:ind w:left="-5" w:right="15"/>
-      </w:pPr>
-      <w:r>
-        <w:t>And Israel was not the first society to imagine release. Mesopotamian rulers issued clean-slate edicts centuries before the biblical Jubilee texts, commonly remitting specified personal or agrarian obligations, restoring people or property, and releasing debt servitude. The Sumerian term amargi is associated with early written language of release or freedom and is conventionally glossed as a return to the mother, although the exact translation and scope deserve the caution given in the notes. [22]</w:t>
+        <w:t>The reset can be read as maintenance as well as mercy. Compounding obligations can concentrate land, labor, and leverage faster than a social system can absorb indefinitely. Ancient law codes and royal clean-slate edicts show that some societies treated periodic release as one tool for restoring the balance. [21]</w:t>
+      </w:r>
+    </w:p>
+    <w:p>
+      <w:pPr>
+        <w:ind w:left="-5" w:right="15"/>
+      </w:pPr>
+      <w:r>
+        <w:t>And Israel was not the first society to imagine release. Mesopotamian rulers issued clean-slate edicts centuries before the biblical Jubilee texts, commonly remitting specified personal or agrarian obligations, restoring people or property, and releasing debt servitude. The Sumerian term amargi is associated with early written language of release or freedom and is conventionally glossed as a return to the mother, although the exact translation and scope deserve the caution given in the notes. [21]</w:t>
       </w:r>
     </w:p>
     <w:p>
@@ -17063,8 +17058,13 @@
       <w:r>
         <w:t>At the London Debt Agreement of 1953, West Germany’s external debt was cut roughly in half and the remainder was placed on unusually favorable terms tied to the country’s capacity to earn foreign exchange. Research finds that the agreement materially improved fiscal space, borrowing conditions, investment, and price stability. It was one important contributor to West Germany’s recovery, alongside the 1948 currency reform, the European Payments Union, reconstruction, trade, institutions, and an economy that was already growing before 1953.</w:t>
       </w:r>
-      <w:r>
-        <w:t xml:space="preserve"> [23]</w:t>
+    </w:p>
+    <w:p>
+      <w:pPr>
+        <w:ind w:left="-5" w:right="15"/>
+      </w:pPr>
+      <w:r>
+        <w:t>[22]</w:t>
       </w:r>
     </w:p>
     <w:p>
@@ -18589,7 +18589,7 @@
         <w:ind w:left="-5" w:right="15"/>
       </w:pPr>
       <w:r>
-        <w:t>Asimov was not writing reassurance. He was writing, eighty years early, the one thing that is hardest to accept about rule-based safety: a sufficiently capable system following your rules will find the case you did not think of, and it will not be disobeying you when it does. [25]</w:t>
+        <w:t>Asimov was not writing reassurance. He was writing, eighty years early, the one thing that is hardest to accept about rule-based safety: a sufficiently capable system following your rules will find the case you did not think of, and it will not be disobeying you when it does. [23]</w:t>
       </w:r>
     </w:p>
     <w:p>
@@ -20778,552 +20778,6 @@
       </w:r>
     </w:p>
     <w:p>
-      <w:pPr/>
-      <w:r>
-        <w:br w:type="page"/>
-      </w:r>
-      <w:r>
-        <w:t>CLOSING</w:t>
-      </w:r>
-    </w:p>
-    <w:p>
-      <w:pPr>
-        <w:pStyle w:val="Heading1"/>
-      </w:pPr>
-      <w:r>
-        <w:t>The Ten Rules</w:t>
-      </w:r>
-    </w:p>
-    <w:p>
-      <w:pPr/>
-      <w:r>
-        <w:t>What Should Have Been Carved Instead</w:t>
-      </w:r>
-    </w:p>
-    <w:p>
-      <w:pPr/>
-      <w:r>
-        <w:t>Somewhere around four thousand years ago, by the account most of the West inherited, a set of instructions was handed down for how human beings should live. Ten of them, short enough to memorize and portable enough to carry, and still quoted today in courtrooms by people who could not tell you where they came from.</w:t>
-      </w:r>
-    </w:p>
-    <w:p>
-      <w:pPr/>
-      <w:r>
-        <w:t>Take them seriously as engineering, because that is what they were. Somebody had one chance at compressing everything a civilization needed into something a shepherd could hold in his head. Now audit what they spent it on.</w:t>
-      </w:r>
-    </w:p>
-    <w:p>
-      <w:pPr/>
-      <w:r>
-        <w:t>Four of the ten are about the authority itself. No other gods, no images, do not misuse the name, keep the day set aside. Forty percent of the most valuable transmission slot in human history went to protecting the standing of whoever was issuing the instructions.</w:t>
-      </w:r>
-    </w:p>
-    <w:p>
-      <w:pPr/>
-      <w:r>
-        <w:t>Five of the remaining six are ordinary prohibitions that every society on earth had already worked out on its own, because no group survives without them. Do not murder. Do not steal. Do not lie about your neighbor. Peoples who never heard the list arrived at every one. The last is a rule about wanting things, which nobody can observe and therefore nobody can enforce.</w:t>
-      </w:r>
-    </w:p>
-    <w:p>
-      <w:pPr/>
-      <w:r>
-        <w:t>Nothing in the ten says how a government should be ordered. Nothing says how a group larger than a household should coordinate. Nothing restrains an institution, because every rule is aimed at an individual, which means a state can break all ten at once while every citizen inside it stays personally innocent. Nothing expires. And nothing anywhere in the list allows the list to be changed.</w:t>
-      </w:r>
-    </w:p>
-    <w:p>
-      <w:pPr/>
-      <w:r>
-        <w:rPr>
-          <w:i/>
-        </w:rPr>
-        <w:t>That last absence is the fatal one. Instructions with no revision clause are not a constitution. They are a lock. They can only be obeyed or abandoned, and both of those outcomes serve whoever is holding the chisel.</w:t>
-      </w:r>
-    </w:p>
-    <w:p>
-      <w:pPr/>
-      <w:r>
-        <w:t>So if you had that slot, and one shot at it, and you already knew what the next four thousand years were going to cost, what would you carve instead? Not rules for a person. A person is not where the damage happens. Rules for the thing that does the damage, which is a group large enough that nobody inside it feels responsible for what it does.</w:t>
-      </w:r>
-    </w:p>
-    <w:p>
-      <w:pPr/>
-      <w:r>
-        <w:t>And they would have to be written the way the first ten were written, in words a child can hold, because a rule a child cannot repeat is a rule that will not survive one generation.</w:t>
-      </w:r>
-    </w:p>
-    <w:p>
-      <w:pPr>
-        <w:pStyle w:val="Heading2"/>
-      </w:pPr>
-      <w:r>
-        <w:t>One, If Someone Is Hungry, Feed Them</w:t>
-      </w:r>
-    </w:p>
-    <w:p>
-      <w:pPr/>
-      <w:r>
-        <w:rPr>
-          <w:b/>
-        </w:rPr>
-        <w:t>If someone is hungry, feed them.</w:t>
-      </w:r>
-    </w:p>
-    <w:p>
-      <w:pPr/>
-      <w:r>
-        <w:t>Not grudgingly, and not after asking what they did to deserve it. The way you would feed your own child, with the same face you would use on your own child, and then ask if they need anything else. Food, a place to sleep, and something to wear are the three things a person cannot live without, and a society that can produce far more of all three than it needs and still has people without them has not run out of food. It has run out of the willingness to hand it over. Repairing something and giving it again is not a lesser gift. It was good enough for the person who owned it until the day they stopped, so it is good enough for one more. And it must never once be possible to say that a person took too much. The moment that sentence is available, the rule is gone, because everyone who needs help will hear it before they ask.</w:t>
-      </w:r>
-    </w:p>
-    <w:p>
-      <w:pPr>
-        <w:pStyle w:val="Heading2"/>
-      </w:pPr>
-      <w:r>
-        <w:t>Two, If Someone Is Hurt, Help Them</w:t>
-      </w:r>
-    </w:p>
-    <w:p>
-      <w:pPr/>
-      <w:r>
-        <w:rPr>
-          <w:b/>
-        </w:rPr>
-        <w:t>If someone is hurt, help them.</w:t>
-      </w:r>
-    </w:p>
-    <w:p>
-      <w:pPr/>
-      <w:r>
-        <w:t>Anyone. Including a stranger, including someone you dislike, including someone from the other side of whatever line is currently being drawn. A person bleeding in front of you is not a member of a group at that moment, and treating them as one is the beginning of every atrocity in this book. This runs the other direction as well. If you hurt someone, you answer for it. If you sell food you know is poisoned, or medicine you know does not work, or a house you know will not stand, you have not made a bad business decision. You have hurt someone for money, which is worse than hurting them in anger, because anger passes and a decision to profit does not.</w:t>
-      </w:r>
-    </w:p>
-    <w:p>
-      <w:pPr>
-        <w:pStyle w:val="Heading2"/>
-      </w:pPr>
-      <w:r>
-        <w:t>Three, After Seven Years the Debt Is Gone</w:t>
-      </w:r>
-    </w:p>
-    <w:p>
-      <w:pPr/>
-      <w:r>
-        <w:rPr>
-          <w:b/>
-        </w:rPr>
-        <w:t>After seven years, the debt is gone.</w:t>
-      </w:r>
-    </w:p>
-    <w:p>
-      <w:pPr/>
-      <w:r>
-        <w:t>Every debt, without exception and without appeal. Seven years is the whole life of an obligation, and after that the slate is wiped, whatever remains unpaid is finished, and whatever was pledged against it belongs to the person who was carrying it. Nobody has to forgive anything, and no creditor has to be persuaded. The calendar does it, which is the only way it has ever been done, because no lender in history has volunteered.</w:t>
-      </w:r>
-    </w:p>
-    <w:p>
-      <w:pPr>
-        <w:pStyle w:val="Heading2"/>
-      </w:pPr>
-      <w:r>
-        <w:t>Four, Nobody Keeps a Powerful Job Forever</w:t>
-      </w:r>
-    </w:p>
-    <w:p>
-      <w:pPr/>
-      <w:r>
-        <w:rPr>
-          <w:b/>
-        </w:rPr>
-        <w:t>Nobody keeps a powerful job forever.</w:t>
-      </w:r>
-    </w:p>
-    <w:p>
-      <w:pPr/>
-      <w:r>
-        <w:t>Every seat with power over other people empties on a fixed date that everyone knows in advance, no matter how good the person in it is and no matter what is happening at the time. Emergencies are exactly when this rule gets suspended, which is exactly why it must not be. A job you can hold indefinitely stops being a job and becomes something you own, and people defend what they own. Most of what gets called corruption is just an office that outlasted its reason.</w:t>
-      </w:r>
-    </w:p>
-    <w:p>
-      <w:pPr>
-        <w:pStyle w:val="Heading2"/>
-      </w:pPr>
-      <w:r>
-        <w:t>Five, Every Choice Has a Name on It</w:t>
-      </w:r>
-    </w:p>
-    <w:p>
-      <w:pPr/>
-      <w:r>
-        <w:rPr>
-          <w:b/>
-        </w:rPr>
-        <w:t>Every choice has a name on it.</w:t>
-      </w:r>
-    </w:p>
-    <w:p>
-      <w:pPr/>
-      <w:r>
-        <w:t>Not a department, not a committee, not a process, not a system. A person, named, who can be asked why. A person can be questioned, refused, removed, prosecuted, and made to sit in a room with the people it happened to. None of those can be done to an institution. When responsibility is shared by everyone it is held by nobody, and the harm arrives with no name attached to it. Every death gets counted and every death gets answered, without exception, because a death nobody answers for is a public announcement of the price of the next one.</w:t>
-      </w:r>
-    </w:p>
-    <w:p>
-      <w:pPr>
-        <w:pStyle w:val="Heading2"/>
-      </w:pPr>
-      <w:r>
-        <w:t>Six, Nobody Can Buy a Rule</w:t>
-      </w:r>
-    </w:p>
-    <w:p>
-      <w:pPr/>
-      <w:r>
-        <w:rPr>
-          <w:b/>
-        </w:rPr>
-        <w:t>Nobody can buy a rule.</w:t>
-      </w:r>
-    </w:p>
-    <w:p>
-      <w:pPr/>
-      <w:r>
-        <w:t>No money may move, in any direction and under any name, between the people who make the rules and the people the rules are made about. Not a payment, not a gift, not a job offered afterward, not a donation to something a family member runs. This is the single most efficient way to corrupt a government that has ever been invented, and it does not require anyone to be a criminal. It requires only that the people who write the rules and the people who profit from them are allowed to be in the same room with a checkbook. If money is the root of anything, it is this: not coins, but the ability to pay a stranger to decide in your favor and call the result a law.</w:t>
-      </w:r>
-    </w:p>
-    <w:p>
-      <w:pPr>
-        <w:pStyle w:val="Heading2"/>
-      </w:pPr>
-      <w:r>
-        <w:t>Seven, Use Words a Child Knows</w:t>
-      </w:r>
-    </w:p>
-    <w:p>
-      <w:pPr/>
-      <w:r>
-        <w:rPr>
-          <w:b/>
-        </w:rPr>
-        <w:t>Use words a child knows.</w:t>
-      </w:r>
-    </w:p>
-    <w:p>
-      <w:pPr/>
-      <w:r>
-        <w:t>In every public act, every law, every order, every explanation given by anyone with power. If a thing cannot be described in words a ten-year-old understands, it may not be done in the name of the people. This is not a rule about style. Every large cruelty in recorded history arrived wearing a phrase built to stop the listener from picturing it, and the phrase is not decoration on the act. It is part of the machinery, because a thing nobody can picture is a thing nobody stops.</w:t>
-      </w:r>
-    </w:p>
-    <w:p>
-      <w:pPr>
-        <w:pStyle w:val="Heading2"/>
-      </w:pPr>
-      <w:r>
-        <w:t>Eight, You Cannot Hide It From the People It Happens To</w:t>
-      </w:r>
-    </w:p>
-    <w:p>
-      <w:pPr/>
-      <w:r>
-        <w:rPr>
-          <w:b/>
-        </w:rPr>
-        <w:t>You cannot hide it from the people it happens to.</w:t>
-      </w:r>
-    </w:p>
-    <w:p>
-      <w:pPr/>
-      <w:r>
-        <w:t>Anyone a decision is made about is entitled to the record of it. Secrecy may delay that for a stated time, named in advance, and may never cancel it. Nothing that takes from a group survives being watched by that group. That is why every arrangement of the kind spends so much of its energy on not being watched, and why the demand to look away is never a denial. It is a request for help.</w:t>
-      </w:r>
-    </w:p>
-    <w:p>
-      <w:pPr>
-        <w:pStyle w:val="Heading2"/>
-      </w:pPr>
-      <w:r>
-        <w:t>Nine, Anyone Can Walk Away</w:t>
-      </w:r>
-    </w:p>
-    <w:p>
-      <w:pPr/>
-      <w:r>
-        <w:rPr>
-          <w:b/>
-        </w:rPr>
-        <w:t>Anyone can walk away.</w:t>
-      </w:r>
-    </w:p>
-    <w:p>
-      <w:pPr/>
-      <w:r>
-        <w:t>No group may be built so that leaving costs you your family, your work, your standing, and your account of what happens when you die. Leaving may cost you the thing itself and nothing more. A promise you cannot withdraw is not loyalty. It is capture. And the true strength of any group is the number of people who stay once the door is genuinely open.</w:t>
-      </w:r>
-    </w:p>
-    <w:p>
-      <w:pPr>
-        <w:pStyle w:val="Heading2"/>
-      </w:pPr>
-      <w:r>
-        <w:t>Ten, Every Twenty Years New People Read These Rules and Fix Them</w:t>
-      </w:r>
-    </w:p>
-    <w:p>
-      <w:pPr/>
-      <w:r>
-        <w:rPr>
-          <w:b/>
-        </w:rPr>
-        <w:t>Every twenty years, new people read these rules and fix them.</w:t>
-      </w:r>
-    </w:p>
-    <w:p>
-      <w:pPr/>
-      <w:r>
-        <w:t>In public, on a schedule, by people who had no hand in writing them, with full power to change or delete any of the nine above and this one. A rule that survives only because it was inherited has stopped being a rule and become a habit. This is last because it is the only thing that makes the other nine safe, and its absence is the exact defect that ruined every code that came before.</w:t>
-      </w:r>
-    </w:p>
-    <w:p>
-      <w:pPr>
-        <w:pStyle w:val="Heading2"/>
-      </w:pPr>
-      <w:r>
-        <w:t>The Seven Year Slate</w:t>
-      </w:r>
-    </w:p>
-    <w:p>
-      <w:pPr/>
-      <w:r>
-        <w:rPr>
-          <w:i/>
-        </w:rPr>
-        <w:t>On Rule Three, and where the phrase comes from.</w:t>
-      </w:r>
-    </w:p>
-    <w:p>
-      <w:pPr/>
-      <w:r>
-        <w:t>People say wipe the slate clean without knowing they are talking about money, and the original is worth having, because it goes straight back to the beginning.</w:t>
-      </w:r>
-    </w:p>
-    <w:p>
-      <w:pPr/>
-      <w:r>
-        <w:t>Before paper was cheap, a tavern keeper kept a piece of slate on the wall. When a man drank and could not pay, the amount went on the slate in chalk under his name, and it stayed there in front of everyone until he settled. When he paid, the keeper wiped it off with a cloth, and the stone was blank again as though nothing had ever been owed.</w:t>
-      </w:r>
-    </w:p>
-    <w:p>
-      <w:pPr/>
-      <w:r>
-        <w:t>The Latin behind it is older and says the same thing. A tabula rasa is a scraped tablet: a Roman wax board that had been written on and then heated and smoothed flat, so that whatever it had recorded was simply not there anymore.</w:t>
-      </w:r>
-    </w:p>
-    <w:p>
-      <w:pPr/>
-      <w:r>
-        <w:rPr>
-          <w:i/>
-        </w:rPr>
-        <w:t>A clean slate has never meant a fresh mind or a new start in the vague sense people use it now. It meant a debt erased. The oldest phrase we have for freedom in English is a description of somebody wiping what you owed off a stone.</w:t>
-      </w:r>
-    </w:p>
-    <w:p>
-      <w:pPr/>
-      <w:r>
-        <w:t>So Rule Three is not an invention. It is the phrase taken literally, and put on a calendar so that it does not depend on the goodwill of the man holding the cloth.</w:t>
-      </w:r>
-    </w:p>
-    <w:p>
-      <w:pPr>
-        <w:pStyle w:val="Heading2"/>
-      </w:pPr>
-      <w:r>
-        <w:t>How You Keep Score Without Keeping a Chain</w:t>
-      </w:r>
-    </w:p>
-    <w:p>
-      <w:pPr/>
-      <w:r>
-        <w:t>A debt that expires does not mean a promise that never mattered. There still has to be a way to know whether a person keeps their word, or nobody will lend anything to anyone. The answer is to record the honor rather than the money.</w:t>
-      </w:r>
-    </w:p>
-    <w:p>
-      <w:pPr/>
-      <w:r>
-        <w:t>Not a number. A history. Did this person agree to a thing and then do it? How many agreements have they completed? How many ran the full seven years and finished unpaid?</w:t>
-      </w:r>
-    </w:p>
-    <w:p>
-      <w:pPr/>
-      <w:r>
-        <w:t>That record is the only asset any of us actually carry, and it is far more informative than a balance, because a balance tells you what someone has and honor tells you what they do.</w:t>
-      </w:r>
-    </w:p>
-    <w:p>
-      <w:pPr/>
-      <w:r>
-        <w:t>And that record expires too, on the same clock. Seven years, and the mark is gone. Not sealed, not archived, not available to anyone who pays for access. Gone, the way chalk goes when a cloth crosses it, so that no person can be held for life against the worst season they ever had.</w:t>
-      </w:r>
-    </w:p>
-    <w:p>
-      <w:pPr/>
-      <w:r>
-        <w:rPr>
-          <w:i/>
-        </w:rPr>
-        <w:t>Everyone gets to fail, and everyone gets to stop having failed. Any system that remembers forever has quietly decided that a person is the worst thing they have ever done, and no society that believes that has ever been a good place to live in.</w:t>
-      </w:r>
-    </w:p>
-    <w:p>
-      <w:pPr>
-        <w:pStyle w:val="Heading2"/>
-      </w:pPr>
-      <w:r>
-        <w:t>Two Hard Questions</w:t>
-      </w:r>
-    </w:p>
-    <w:p>
-      <w:pPr/>
-      <w:r>
-        <w:rPr>
-          <w:i/>
-        </w:rPr>
-        <w:t>Which any set of rules has to answer, or admit it cannot.</w:t>
-      </w:r>
-    </w:p>
-    <w:p>
-      <w:pPr/>
-      <w:r>
-        <w:rPr>
-          <w:b/>
-        </w:rPr>
-        <w:t>What do you do with someone who hurts people?</w:t>
-      </w:r>
-    </w:p>
-    <w:p>
-      <w:pPr/>
-      <w:r>
-        <w:t>Rule Two says the person who is hurt gets helped and the person who did it answers for it. It does not say what answering means, and that is the question every society actually fights about.</w:t>
-      </w:r>
-    </w:p>
-    <w:p>
-      <w:pPr/>
-      <w:r>
-        <w:t>Start from what is being purchased. Punishment buys three different things and they are usually confused with each other: stopping this person from doing it again, discouraging the next person, and satisfying the feeling of the people who were harmed. Only the first is a safety measure. The second is a claim about deterrence that mostly does not survive being measured. The third is real, and it is not nothing, but it is a feeling and should be named as one rather than dressed up as justice.</w:t>
-      </w:r>
-    </w:p>
-    <w:p>
-      <w:pPr/>
-      <w:r>
-        <w:t>So the rule is this. Separate a person from others only for as long as they are actually dangerous, and prove it again on a schedule rather than assuming it. Everything else that happens to them during that time should be aimed at the day they come out, because almost all of them come out, and a system that returns a person worse than it received him has not protected anybody. It has bought a few quiet years and paid for them with the next victim.</w:t>
-      </w:r>
-    </w:p>
-    <w:p>
-      <w:pPr/>
-      <w:r>
-        <w:rPr>
-          <w:i/>
-        </w:rPr>
-        <w:t>Ask the only question that measures anything: does this person harm someone again? Every practice that lowers that number is justice, whatever it feels like, and every practice that raises it is revenge wearing a uniform, however satisfying it is to watch.</w:t>
-      </w:r>
-    </w:p>
-    <w:p>
-      <w:pPr/>
-      <w:r>
-        <w:t>And Rule Ten applies here more than anywhere. A society that never reexamines what it does to its prisoners will discover, every single time, that it has been running a machine for producing the exact people it says it is protecting itself from.</w:t>
-      </w:r>
-    </w:p>
-    <w:p>
-      <w:pPr/>
-      <w:r>
-        <w:rPr>
-          <w:b/>
-        </w:rPr>
-        <w:t>What does a country do when it is attacked?</w:t>
-      </w:r>
-    </w:p>
-    <w:p>
-      <w:pPr/>
-      <w:r>
-        <w:t>This is the hardest one in the set, and any rule that pretends otherwise is lying.</w:t>
-      </w:r>
-    </w:p>
-    <w:p>
-      <w:pPr/>
-      <w:r>
-        <w:t>A state that is attacked will strike back. That is not a policy choice; it is what states do, and a rule that simply forbids it will be ignored the first morning it matters. So the rule has to constrain the striking rather than deny it.</w:t>
-      </w:r>
-    </w:p>
-    <w:p>
-      <w:pPr/>
-      <w:r>
-        <w:t>Rule Five carries most of the weight. A name on every order, before it is given. Not afterward, not in a review two years later, but attached at the moment of decision, so that the person who authorizes a strike knows their name will sit beside the result forever. Almost nothing else changes behavior. It is far easier to sign for a target than to sign for a school, and the entire purpose of every euphemism in Rule Seven is to make those two feel like the same signature.</w:t>
-      </w:r>
-    </w:p>
-    <w:p>
-      <w:pPr/>
-      <w:r>
-        <w:t>Then Rule Seven does the rest. Describe the target in words a child understands before the order is valid. Not neutralize the site. Say what is there. If the sentence cannot be said out loud in plain language to the people whose name it is done in, it does not get signed.</w:t>
-      </w:r>
-    </w:p>
-    <w:p>
-      <w:pPr/>
-      <w:r>
-        <w:t>There is a harder version of the question underneath, and it deserves an honest answer rather than a slogan. When one side fights from bases and the other fights from among houses, any strike at the second reaches people who chose nothing. Calling that unavoidable is usually a way of avoiding the decision rather than describing it.</w:t>
-      </w:r>
-    </w:p>
-    <w:p>
-      <w:pPr/>
-      <w:r>
-        <w:t>The rules here do not solve that, and no rule does. What they change is who has to own it. Under Rule Five somebody signs, by name. Under Rule Seven that person has to write down what they are actually aiming at, in words their own child could read. Under Rule Eight it cannot be sealed from the people it happened to. And under Rule Two every death is counted, including theirs, on the same list, in the same numbers, in public.</w:t>
-      </w:r>
-    </w:p>
-    <w:p>
-      <w:pPr/>
-      <w:r>
-        <w:rPr>
-          <w:i/>
-        </w:rPr>
-        <w:t>You cannot legislate a war into being clean. You can make it impossible to conduct one anonymously, and almost every atrocity in this book required anonymity somewhere in the chain.</w:t>
-      </w:r>
-    </w:p>
-    <w:p>
-      <w:pPr>
-        <w:pStyle w:val="Heading2"/>
-      </w:pPr>
-      <w:r>
-        <w:t>The Objection</w:t>
-      </w:r>
-    </w:p>
-    <w:p>
-      <w:pPr/>
-      <w:r>
-        <w:rPr>
-          <w:i/>
-        </w:rPr>
-        <w:t>These would have been ignored, and that objection is correct.</w:t>
-      </w:r>
-    </w:p>
-    <w:p>
-      <w:pPr/>
-      <w:r>
-        <w:t>Rules One, Three, Six and Nine cost the people carving them everything they had, which is exactly why no ancient code contains anything resembling them. Every law that survives from that period was written by whoever had already won, and Rule Ten, the one that hands the code to strangers every twenty years and lets them change it, is the last thing a winner ever writes down.</w:t>
-      </w:r>
-    </w:p>
-    <w:p>
-      <w:pPr/>
-      <w:r>
-        <w:t>Which is the actual argument, and it is not about antiquity. The old ten are not defective because their authors were primitive. They are defective in the exact direction that served the people holding the chisel, and four thousand years later almost every institution still runs on a code with the same shape: strict about personal conduct, silent about power, and containing no instruction for its own repair.</w:t>
-      </w:r>
-    </w:p>
-    <w:p>
-      <w:pPr/>
-      <w:r>
-        <w:rPr>
-          <w:i/>
-        </w:rPr>
-        <w:t>You do not need a mountain to fix that. You need a calendar, a name on every decision, plain words, an open door, and a rule that says this list gets read again by people who had no hand in writing it.</w:t>
-      </w:r>
-    </w:p>
-    <w:p>
       <w:pPr>
         <w:pStyle w:val="Heading2"/>
         <w:ind w:left="-5"/>
@@ -22653,24 +22107,15 @@
         <w:rPr>
           <w:b/>
         </w:rPr>
-        <w:t>1. Opening: God of the gaps</w:t>
-      </w:r>
-    </w:p>
-    <w:p>
-      <w:pPr>
-        <w:spacing w:after="0"/>
-        <w:ind w:left="-5" w:right="15"/>
-      </w:pPr>
-      <w:r>
-        <w:t>Henry Drummond used the image in his 1893 Lowell Lectures, published as The Ascent of Man (1894), writing of reverent minds who scan Nature and Science in search of gaps which they will fill up with God. Charles A. Coulson gave the phrase its permanent form in Science and Christian Belief (1955), observing that gaps of this sort have the unpreventable habit of shrinking. ESTABLISHED</w:t>
-      </w:r>
-    </w:p>
-    <w:p>
-      <w:pPr>
-        <w:ind w:left="-5" w:right="15"/>
-      </w:pPr>
-      <w:r>
-        <w:t>SOURCE.</w:t>
+        <w:t>Opening: The Sign</w:t>
+      </w:r>
+    </w:p>
+    <w:p>
+      <w:pPr>
+        <w:ind w:left="-5" w:right="15"/>
+      </w:pPr>
+      <w:r>
+        <w:t>Plato gives the accusation as corrupting the young and failing to recognize the gods recognized by the city while introducing new divine or spiritual things. Plato, Apology 24b–c. The restraining sign is discussed at Apology 31c–d, and the silence at the trial at Apology 40a–c. The biological reading offered here is the author’s retrospective synthesis; Plato’s text establishes Socrates’ report and his own interpretation of it, not a mitochondrial diagnosis. Perseus Digital Library, perseus.tufts.edu. HISTORICAL RECONSTRUCTION; AUTHOR’S SYNTHESIS.</w:t>
       </w:r>
     </w:p>
     <w:p>
@@ -22686,15 +22131,213 @@
         <w:rPr>
           <w:b/>
         </w:rPr>
-        <w:t>2. Opening: The Sign</w:t>
-      </w:r>
-    </w:p>
-    <w:p>
-      <w:pPr>
-        <w:ind w:left="-5" w:right="15"/>
-      </w:pPr>
-      <w:r>
-        <w:t>Plato gives the accusation as corrupting the young and failing to recognize the gods recognized by the city while introducing new divine or spiritual things. Plato, Apology 24b–c. The restraining sign is discussed at Apology 31c–d, and the silence at the trial at Apology 40a–c. The biological reading offered here is the author’s retrospective synthesis; Plato’s text establishes Socrates’ report and his own interpretation of it, not a mitochondrial diagnosis. Perseus Digital Library, perseus.tufts.edu. HISTORICAL RECONSTRUCTION; AUTHOR’S SYNTHESIS.</w:t>
+        <w:t>Opening: God of the gaps</w:t>
+      </w:r>
+    </w:p>
+    <w:p>
+      <w:pPr>
+        <w:spacing w:after="0"/>
+        <w:ind w:left="-5" w:right="15"/>
+      </w:pPr>
+      <w:r>
+        <w:t>Henry Drummond used the image in his 1893 Lowell Lectures, published as The Ascent of Man (1894), writing of reverent minds who scan Nature and Science in search of gaps which they will fill up with God. Charles A. Coulson gave the phrase its permanent form in Science and Christian Belief (1955), observing that gaps of this sort have the unpreventable habit of shrinking. ESTABLISHED</w:t>
+      </w:r>
+    </w:p>
+    <w:p>
+      <w:pPr>
+        <w:ind w:left="-5" w:right="15"/>
+      </w:pPr>
+      <w:r>
+        <w:t>SOURCE.</w:t>
+      </w:r>
+    </w:p>
+    <w:p>
+      <w:pPr>
+        <w:numPr>
+          <w:ilvl w:val="0"/>
+          <w:numId w:val="1"/>
+        </w:numPr>
+        <w:spacing w:after="142" w:line="259" w:lineRule="auto"/>
+        <w:ind w:hanging="202"/>
+      </w:pPr>
+      <w:r>
+        <w:rPr>
+          <w:b/>
+        </w:rPr>
+        <w:t>Chapter Two: Musashi</w:t>
+      </w:r>
+    </w:p>
+    <w:p>
+      <w:pPr>
+        <w:spacing w:after="0"/>
+        <w:ind w:left="-5" w:right="15"/>
+      </w:pPr>
+      <w:r>
+        <w:t>The author encountered this account through the AfterSkool channel on YouTube, and that is the telling used here. The duel with Sasaki Kojirō is historical, but many familiar details, including the theatrical lateness, the weapon carved from an oar during the crossing, the length of that weapon, and the exact psychological sequence, reach us through later narrative traditions rather than any contemporary neutral account. The chapter uses the strategic shape of the story rather than claiming forensic certainty about any single detail.</w:t>
+      </w:r>
+    </w:p>
+    <w:p>
+      <w:pPr>
+        <w:ind w:left="-5" w:right="15"/>
+      </w:pPr>
+      <w:r>
+        <w:t>SECONDARY RETELLING; HISTORICAL CORE WITH LEGENDARY DETAIL.</w:t>
+      </w:r>
+    </w:p>
+    <w:p>
+      <w:pPr>
+        <w:numPr>
+          <w:ilvl w:val="0"/>
+          <w:numId w:val="1"/>
+        </w:numPr>
+        <w:spacing w:after="142" w:line="259" w:lineRule="auto"/>
+        <w:ind w:hanging="202"/>
+      </w:pPr>
+      <w:r>
+        <w:rPr>
+          <w:b/>
+        </w:rPr>
+        <w:t>Chapter Three: Three Monkeys</w:t>
+      </w:r>
+    </w:p>
+    <w:p>
+      <w:pPr>
+        <w:ind w:left="-5" w:right="15"/>
+      </w:pPr>
+      <w:r>
+        <w:t>The maxim associated with Mizaru, Kikazaru, and Iwazaru is conventionally rendered see no evil, hear no evil, speak no evil, and has been connected with Kōshin traditions, moral discipline, avoidance, and later satirical meanings. The carving at Nikkō Tōshō-gū dates from the seventeenth century and is one of eight panels depicting the stages of a life. The negative suffix -zaru coincides with the combining form of saru, monkey, which is why the teaching acquired animals. The Japanese contains no word corresponding to evil; that term entered in translation. The three-stage verification sequence in this chapter is a deliberate modern reversal by the author, not a claim about original meaning. A. W. Smith, On the Ambiguity of the Three Wise Monkeys, Folklore 104, no. 1–2 (1993): 144– 150. DISPUTED INTERPRETATION; AUTHOR’S SYNTHESIS.</w:t>
+      </w:r>
+    </w:p>
+    <w:p>
+      <w:pPr>
+        <w:numPr>
+          <w:ilvl w:val="0"/>
+          <w:numId w:val="1"/>
+        </w:numPr>
+        <w:spacing w:after="142" w:line="259" w:lineRule="auto"/>
+        <w:ind w:hanging="202"/>
+      </w:pPr>
+      <w:r>
+        <w:rPr>
+          <w:b/>
+        </w:rPr>
+        <w:t>Chapter Three: spell and gospel</w:t>
+      </w:r>
+    </w:p>
+    <w:p>
+      <w:pPr>
+        <w:spacing w:after="0"/>
+        <w:ind w:left="-5" w:right="15"/>
+      </w:pPr>
+      <w:r>
+        <w:t>Old English spell meant a story, an account, or a spoken utterance, and survives in gospel, from gōd-spell, good tidings. The incantation sense descends from the same word. The sense meaning to name the letters of a word is a separate borrowing through Old French and is not related, so the popular claim that spelling and casting a spell are one act is not supported. Greek euangelion was in use for imperial proclamations before the New Testament writers adopted it.</w:t>
+      </w:r>
+    </w:p>
+    <w:p>
+      <w:pPr>
+        <w:ind w:left="-5" w:right="15"/>
+      </w:pPr>
+      <w:r>
+        <w:t>ESTABLISHED ETYMOLOGY; POPULAR VERSION CORRECTED.</w:t>
+      </w:r>
+    </w:p>
+    <w:p>
+      <w:pPr>
+        <w:numPr>
+          <w:ilvl w:val="0"/>
+          <w:numId w:val="1"/>
+        </w:numPr>
+        <w:spacing w:after="142" w:line="259" w:lineRule="auto"/>
+        <w:ind w:hanging="202"/>
+      </w:pPr>
+      <w:r>
+        <w:rPr>
+          <w:b/>
+        </w:rPr>
+        <w:t>Chapter Four: Minab, responsibility</w:t>
+      </w:r>
+    </w:p>
+    <w:p>
+      <w:pPr>
+        <w:ind w:left="-5" w:right="15"/>
+      </w:pPr>
+      <w:r>
+        <w:t>Amnesty International analyzed satellite imagery, video, photographs, reported munition remnants, official statements, and interviews concerning the attack of 28 February 2026, concluded that U.S. forces were responsible, and found that the school was directly struck during a wider attack on the adjoining IRGC compound. Amnesty concluded that feasible precautions to protect civilians were not taken and characterized the strike as unlawful and a serious breach of international humanitarian law; it also said that a reckless attack without required precautions must be investigated as a possible war crime. Amnesty found a Tomahawk likely visible in footage of the wider compound attack but could not independently verify that the school itself was struck by that same munition. Reuters reported on 13 July 2026 that more than two dozen U.S. senators were demanding release of the Pentagon investigation and that Pentagon officials said the probe was still ongoing. Amnesty International, 16 March 2026, updated 28 April 2026; Reuters, 13 July 2026. RESPONSIBILITY AND IHL FINDING BY AMNESTY; U.S. INVESTIGATION NOT PUBLICLY COMPLETE AT THIS EDITION.</w:t>
+      </w:r>
+    </w:p>
+    <w:p>
+      <w:pPr>
+        <w:numPr>
+          <w:ilvl w:val="0"/>
+          <w:numId w:val="1"/>
+        </w:numPr>
+        <w:spacing w:after="142" w:line="259" w:lineRule="auto"/>
+        <w:ind w:hanging="202"/>
+      </w:pPr>
+      <w:r>
+        <w:rPr>
+          <w:b/>
+        </w:rPr>
+        <w:t>Chapter Four: Minab, casualties</w:t>
+      </w:r>
+    </w:p>
+    <w:p>
+      <w:pPr>
+        <w:spacing w:after="0"/>
+        <w:ind w:left="-5" w:right="15"/>
+      </w:pPr>
+      <w:r>
+        <w:t>The figures remain source-dependent and should not be merged. Amnesty’s updated account used an official total of 156 dead including 120 children. Airwars independently identified a different total. The Associated Press reported school staff and parents among the dead. Satellite and open-source reconstruction agree that the school had once formed part of the adjoining compound but had been separated and operating as a school for more than a decade. Public reporting also supports multiple impacts in the area, but the sequence alone does not establish deliberate double-tap intent against rescuers. Forensic Architecture, Airstrikes on</w:t>
+      </w:r>
+    </w:p>
+    <w:p>
+      <w:pPr>
+        <w:spacing w:after="3"/>
+        <w:ind w:left="-5" w:right="15"/>
+      </w:pPr>
+      <w:r>
+        <w:t>Minab; Associated Press, 1 July 2026; Reuters, 13 July 2026. SOURCE-</w:t>
+      </w:r>
+    </w:p>
+    <w:p>
+      <w:pPr>
+        <w:ind w:left="-5" w:right="15"/>
+      </w:pPr>
+      <w:r>
+        <w:t>DEPENDENT TOTALS; INTENT OF REPEATED IMPACTS NOT PUBLICLY ESTABLISHED.</w:t>
+      </w:r>
+    </w:p>
+    <w:p>
+      <w:pPr>
+        <w:numPr>
+          <w:ilvl w:val="0"/>
+          <w:numId w:val="1"/>
+        </w:numPr>
+        <w:spacing w:after="142" w:line="259" w:lineRule="auto"/>
+        <w:ind w:hanging="202"/>
+      </w:pPr>
+      <w:r>
+        <w:rPr>
+          <w:b/>
+        </w:rPr>
+        <w:t>Chapter Five: penalty gestures</w:t>
+      </w:r>
+    </w:p>
+    <w:p>
+      <w:pPr>
+        <w:spacing w:after="0"/>
+        <w:ind w:left="-5" w:right="15"/>
+      </w:pPr>
+      <w:r>
+        <w:t>Published nineteenth-century Masonic ritual monitors describe symbolic penalties involving the throat and chest, although wording and practice differed among degrees, jurisdictions, periods, and ritual families. Corresponding gestures appeared in Latter-day Saint temple ceremonies until they were removed in April</w:t>
+      </w:r>
+    </w:p>
+    <w:p>
+      <w:pPr>
+        <w:ind w:left="-5" w:right="15"/>
+      </w:pPr>
+      <w:r>
+        <w:t>1990. Malcolm C. Duncan, Duncan’s Masonic Ritual and Monitor (1866), public domain. HISTORICAL TEXT; PRACTICE VARIED BY JURISDICTION.</w:t>
       </w:r>
     </w:p>
     <w:p>
@@ -22710,204 +22353,15 @@
         <w:rPr>
           <w:b/>
         </w:rPr>
-        <w:t>3. Chapter One: Alan Watts</w:t>
-      </w:r>
-    </w:p>
-    <w:p>
-      <w:pPr>
-        <w:ind w:left="-5" w:right="15"/>
-      </w:pPr>
-      <w:r>
-        <w:t>The distinction between a narrow, deliberate spotlight consciousness and a broad, ambient floodlight consciousness recurs across Watts’s lectures and writing. The observation that conscious attention is at the same time ignore-ance appears in The Book: On the Taboo Against Knowing Who You Are (1966). The phrasing here paraphrases rather than quotes. PARAPHRASE OF PUBLISHED SOURCE.</w:t>
-      </w:r>
-    </w:p>
-    <w:p>
-      <w:pPr>
-        <w:numPr>
-          <w:ilvl w:val="0"/>
-          <w:numId w:val="1"/>
-        </w:numPr>
-        <w:spacing w:after="142" w:line="259" w:lineRule="auto"/>
-        <w:ind w:hanging="202"/>
-      </w:pPr>
-      <w:r>
-        <w:rPr>
-          <w:b/>
-        </w:rPr>
-        <w:t>4. Chapter Two: Musashi</w:t>
-      </w:r>
-    </w:p>
-    <w:p>
-      <w:pPr>
-        <w:spacing w:after="0"/>
-        <w:ind w:left="-5" w:right="15"/>
-      </w:pPr>
-      <w:r>
-        <w:t>The author encountered this account through the AfterSkool channel on YouTube, and that is the telling used here. The duel with Sasaki Kojirō is historical, but many familiar details, including the theatrical lateness, the weapon carved from an oar during the crossing, the length of that weapon, and the exact psychological sequence, reach us through later narrative traditions rather than any contemporary neutral account. The chapter uses the strategic shape of the story rather than claiming forensic certainty about any single detail.</w:t>
-      </w:r>
-    </w:p>
-    <w:p>
-      <w:pPr>
-        <w:ind w:left="-5" w:right="15"/>
-      </w:pPr>
-      <w:r>
-        <w:t>SECONDARY RETELLING; HISTORICAL CORE WITH LEGENDARY DETAIL.</w:t>
-      </w:r>
-    </w:p>
-    <w:p>
-      <w:pPr>
-        <w:numPr>
-          <w:ilvl w:val="0"/>
-          <w:numId w:val="1"/>
-        </w:numPr>
-        <w:spacing w:after="142" w:line="259" w:lineRule="auto"/>
-        <w:ind w:hanging="202"/>
-      </w:pPr>
-      <w:r>
-        <w:rPr>
-          <w:b/>
-        </w:rPr>
-        <w:t>5. Chapter Three: spell and gospel</w:t>
-      </w:r>
-    </w:p>
-    <w:p>
-      <w:pPr>
-        <w:spacing w:after="0"/>
-        <w:ind w:left="-5" w:right="15"/>
-      </w:pPr>
-      <w:r>
-        <w:t>Old English spell meant a story, an account, or a spoken utterance, and survives in gospel, from gōd-spell, good tidings. The incantation sense descends from the same word. The sense meaning to name the letters of a word is a separate borrowing through Old French and is not related, so the popular claim that spelling and casting a spell are one act is not supported. Greek euangelion was in use for imperial proclamations before the New Testament writers adopted it; see the Priene Calendar Inscription (9 BC) for euangelion applied to Augustus.</w:t>
-      </w:r>
-    </w:p>
-    <w:p>
-      <w:pPr>
-        <w:ind w:left="-5" w:right="15"/>
-      </w:pPr>
-      <w:r>
-        <w:t>ESTABLISHED ETYMOLOGY; POPULAR VERSION CORRECTED.</w:t>
-      </w:r>
-    </w:p>
-    <w:p>
-      <w:pPr>
-        <w:numPr>
-          <w:ilvl w:val="0"/>
-          <w:numId w:val="1"/>
-        </w:numPr>
-        <w:spacing w:after="142" w:line="259" w:lineRule="auto"/>
-        <w:ind w:hanging="202"/>
-      </w:pPr>
-      <w:r>
-        <w:rPr>
-          <w:b/>
-        </w:rPr>
-        <w:t>6. Chapter Three: Three Monkeys</w:t>
-      </w:r>
-    </w:p>
-    <w:p>
-      <w:pPr>
-        <w:ind w:left="-5" w:right="15"/>
-      </w:pPr>
-      <w:r>
-        <w:t>The maxim associated with Mizaru, Kikazaru, and Iwazaru is conventionally rendered see no evil, hear no evil, speak no evil, and has been connected with Kōshin traditions, moral discipline, avoidance, and later satirical meanings. The carving at Nikkō Tōshō-gū dates from the seventeenth century and is one of eight panels depicting the stages of a life. The negative suffix -zaru coincides with the combining form of saru, monkey, which is why the teaching acquired animals. The Japanese contains no word corresponding to evil; that term entered in translation. The three-stage verification sequence in this chapter is a deliberate modern reversal by the author, not a claim about original meaning. A. W. Smith, On the Ambiguity of the Three Wise Monkeys, Folklore 104, no. 1–2 (1993): 144– 150. DISPUTED INTERPRETATION; AUTHOR’S SYNTHESIS.</w:t>
-      </w:r>
-    </w:p>
-    <w:p>
-      <w:pPr>
-        <w:numPr>
-          <w:ilvl w:val="0"/>
-          <w:numId w:val="1"/>
-        </w:numPr>
-        <w:spacing w:after="142" w:line="259" w:lineRule="auto"/>
-        <w:ind w:hanging="202"/>
-      </w:pPr>
-      <w:r>
-        <w:rPr>
-          <w:b/>
-        </w:rPr>
-        <w:t>7. Chapter Four: Minab, responsibility</w:t>
-      </w:r>
-    </w:p>
-    <w:p>
-      <w:pPr>
-        <w:ind w:left="-5" w:right="15"/>
-      </w:pPr>
-      <w:r>
-        <w:t>Amnesty International analyzed satellite imagery, video, photographs, reported munition remnants, official statements, and interviews concerning the attack of 28 February 2026, concluded that U.S. forces were responsible, and found that the school was directly struck during a wider attack on the adjoining IRGC compound. Amnesty concluded that feasible precautions to protect civilians were not taken and characterized the strike as unlawful and a serious breach of international humanitarian law; it also said that a reckless attack without required precautions must be investigated as a possible war crime. Amnesty found a Tomahawk likely visible in footage of the wider compound attack but could not independently verify that the school itself was struck by that same munition. Reuters reported on 13 July 2026 that more than two dozen U.S. senators were demanding release of the Pentagon investigation and that Pentagon officials said the probe was still ongoing. Amnesty International, 16 March 2026, updated 28 April 2026; Reuters, 13 July 2026. RESPONSIBILITY AND IHL FINDING BY AMNESTY; U.S. INVESTIGATION NOT PUBLICLY COMPLETE AT THIS EDITION.</w:t>
-      </w:r>
-    </w:p>
-    <w:p>
-      <w:pPr>
-        <w:numPr>
-          <w:ilvl w:val="0"/>
-          <w:numId w:val="1"/>
-        </w:numPr>
-        <w:spacing w:after="142" w:line="259" w:lineRule="auto"/>
-        <w:ind w:hanging="202"/>
-      </w:pPr>
-      <w:r>
-        <w:rPr>
-          <w:b/>
-        </w:rPr>
-        <w:t>8. Chapter Four: Minab, casualties</w:t>
-      </w:r>
-    </w:p>
-    <w:p>
-      <w:pPr>
-        <w:spacing w:after="0"/>
-        <w:ind w:left="-5" w:right="15"/>
-      </w:pPr>
-      <w:r>
-        <w:t>The figures remain source-dependent and should not be merged. Amnesty’s updated account used an official total of 156 dead including 120 children. Airwars independently identified a different total. The Associated Press reported school staff and parents among the dead. Satellite and open-source reconstruction agree that the school had once formed part of the adjoining compound but had been separated and operating as a school for more than a decade. Public reporting also supports multiple impacts in the area, but the sequence alone does not establish deliberate double-tap intent against rescuers. Forensic Architecture, Airstrikes on</w:t>
-      </w:r>
-    </w:p>
-    <w:p>
-      <w:pPr>
-        <w:spacing w:after="3"/>
-        <w:ind w:left="-5" w:right="15"/>
-      </w:pPr>
-      <w:r>
-        <w:t>Minab; Associated Press, 1 July 2026; Reuters, 13 July 2026. SOURCE-</w:t>
-      </w:r>
-    </w:p>
-    <w:p>
-      <w:pPr>
-        <w:ind w:left="-5" w:right="15"/>
-      </w:pPr>
-      <w:r>
-        <w:t>DEPENDENT TOTALS; INTENT OF REPEATED IMPACTS NOT PUBLICLY ESTABLISHED.</w:t>
-      </w:r>
-    </w:p>
-    <w:p>
-      <w:pPr>
-        <w:numPr>
-          <w:ilvl w:val="0"/>
-          <w:numId w:val="1"/>
-        </w:numPr>
-        <w:spacing w:after="142" w:line="259" w:lineRule="auto"/>
-        <w:ind w:hanging="202"/>
-      </w:pPr>
-      <w:r>
-        <w:rPr>
-          <w:b/>
-        </w:rPr>
-        <w:t>9. Chapter Five: penalty gestures</w:t>
-      </w:r>
-    </w:p>
-    <w:p>
-      <w:pPr>
-        <w:spacing w:after="0"/>
-        <w:ind w:left="-5" w:right="15"/>
-      </w:pPr>
-      <w:r>
-        <w:t>Published nineteenth-century Masonic ritual monitors describe symbolic penalties involving the throat and chest, although wording and practice differed among degrees, jurisdictions, periods, and ritual families. Corresponding gestures appeared in Latter-day Saint temple ceremonies until they were removed in April</w:t>
-      </w:r>
-    </w:p>
-    <w:p>
-      <w:pPr>
-        <w:ind w:left="-5" w:right="15"/>
-      </w:pPr>
-      <w:r>
-        <w:t>1990. Malcolm C. Duncan, Duncan’s Masonic Ritual and Monitor (1866), public domain. HISTORICAL TEXT; PRACTICE VARIED BY JURISDICTION.</w:t>
+        <w:t>Chapter Six: the four stories</w:t>
+      </w:r>
+    </w:p>
+    <w:p>
+      <w:pPr>
+        <w:ind w:left="-5" w:right="15"/>
+      </w:pPr>
+      <w:r>
+        <w:t>Genesis 6–9 (Noah), Genesis 41–47 (Joseph, with the sequence of money, livestock, and land at 47:13–26), Genesis 22 (the binding of Isaac). The structural readings offered here are the author’s, not established accounts of authorial intent. AUTHOR’S SYNTHESIS ON ESTABLISHED TEXTS.</w:t>
       </w:r>
     </w:p>
     <w:p>
@@ -22923,15 +22377,15 @@
         <w:rPr>
           <w:b/>
         </w:rPr>
-        <w:t>10. Chapter Six: red words in their century</w:t>
-      </w:r>
-    </w:p>
-    <w:p>
-      <w:pPr>
-        <w:ind w:left="-5" w:right="15"/>
-      </w:pPr>
-      <w:r>
-        <w:t>The readings of the second mile, the right cheek, and the cloak follow Walter Wink, Engaging the Powers (1992) and The Powers That Be (1998), which argue these sayings describe a third option between submission and violent resistance. Widely taught and widely respected, but interpretations of first-century social practice rather than settled fact. DISPUTED INTERPRETATION.</w:t>
+        <w:t>Chapter Six: red words in their century</w:t>
+      </w:r>
+    </w:p>
+    <w:p>
+      <w:pPr>
+        <w:ind w:left="-5" w:right="15"/>
+      </w:pPr>
+      <w:r>
+        <w:t>The readings of the second mile, the right cheek, and the cloak follow Walter Wink, Engaging the Powers (1992) and The Powers That Be (1998), which argue these sayings describe a third option between submission and violent resistance. Widely taught and widely respected, but interpretations of first-century social practice rather than settled fact. On imperial vocabulary, see the Priene Calendar Inscription (9 BC) for euangelion applied to Augustus. DISPUTED INTERPRETATION.</w:t>
       </w:r>
     </w:p>
     <w:p>
@@ -22947,15 +22401,15 @@
         <w:rPr>
           <w:b/>
         </w:rPr>
-        <w:t>11. Chapter Six: the four stories</w:t>
-      </w:r>
-    </w:p>
-    <w:p>
-      <w:pPr>
-        <w:ind w:left="-5" w:right="15"/>
-      </w:pPr>
-      <w:r>
-        <w:t>Genesis 6–9 (Noah), Genesis 41–47 (Joseph, with the sequence of money, livestock, and land at 47:13–26), Genesis 22 (the binding of Isaac). The structural readings offered here are the author’s, not established accounts of authorial intent. AUTHOR’S SYNTHESIS ON ESTABLISHED TEXTS.</w:t>
+        <w:t>Chapter Seven: the 1096 movements</w:t>
+      </w:r>
+    </w:p>
+    <w:p>
+      <w:pPr>
+        <w:ind w:left="-5" w:right="15"/>
+      </w:pPr>
+      <w:r>
+        <w:t>The movements grouped under the First Crusade contained mixed and overlapping motives: penitential devotion, promised spiritual benefits, apocalyptic expectation, family and lordship ties, material ambition, survival pressure, violence, pilgrimage, and political opportunity. It is too simple to divide every participant into a pure believer or a pure opportunist. Jonathan Riley-Smith, The First Crusaders, 1095–1131 (Cambridge, 1997); Jay Rubenstein, Armies of Heaven (Basic Books, 2011). HISTORICAL RECONSTRUCTION.</w:t>
       </w:r>
     </w:p>
     <w:p>
@@ -22971,15 +22425,15 @@
         <w:rPr>
           <w:b/>
         </w:rPr>
-        <w:t>12. Chapter Seven: the 1096 movements</w:t>
-      </w:r>
-    </w:p>
-    <w:p>
-      <w:pPr>
-        <w:ind w:left="-5" w:right="15"/>
-      </w:pPr>
-      <w:r>
-        <w:t>The movements grouped under the First Crusade contained mixed and overlapping motives: penitential devotion, promised spiritual benefits, apocalyptic expectation, family and lordship ties, material ambition, survival pressure, violence, pilgrimage, and political opportunity. It is too simple to divide every participant into a pure believer or a pure opportunist. Jonathan Riley-Smith, The First Crusaders, 1095–1131 (Cambridge, 1997); Jay Rubenstein, Armies of Heaven (Basic Books, 2011). HISTORICAL RECONSTRUCTION.</w:t>
+        <w:t>Chapter Eight: overseas military network</w:t>
+      </w:r>
+    </w:p>
+    <w:p>
+      <w:pPr>
+        <w:ind w:left="-5" w:right="15"/>
+      </w:pPr>
+      <w:r>
+        <w:t>Counts vary because reports use different units. A base may denote a persistent operational installation; a site may denote a smaller facility, an access location, a property grouping, or a separate real-property record inside one installation. The Congressional Research Service report of 10 July 2024 identifies 68 persistent overseas bases in its principal accounting while separately discussing other sites and access arrangements; broader Department of Defense real-property inventories produce much larger site counts. The defensible claim is an unmatched global network, not one timeless total. CRS, U.S. Overseas Basing, R48123. OFFICIAL ESTIMATE; TOTALS DEPEND ON DEFINITIONS.</w:t>
       </w:r>
     </w:p>
     <w:p>
@@ -22995,15 +22449,24 @@
         <w:rPr>
           <w:b/>
         </w:rPr>
-        <w:t>13. Chapter Eight: overseas military network</w:t>
-      </w:r>
-    </w:p>
-    <w:p>
-      <w:pPr>
-        <w:ind w:left="-5" w:right="15"/>
-      </w:pPr>
-      <w:r>
-        <w:t>Counts vary because reports use different units. A base may denote a persistent operational installation; a site may denote a smaller facility, an access location, a property grouping, or a separate real-property record inside one installation. The Congressional Research Service report of 10 July 2024 identifies 68 persistent overseas bases in its principal accounting while separately discussing other sites and access arrangements; broader Department of Defense real-property inventories produce much larger site counts. The defensible claim is an unmatched global network, not one timeless total. CRS, U.S. Overseas Basing, R48123. OFFICIAL ESTIMATE; TOTALS DEPEND ON DEFINITIONS.</w:t>
+        <w:t>Chapter Eight: Iraq and the euro</w:t>
+      </w:r>
+    </w:p>
+    <w:p>
+      <w:pPr>
+        <w:spacing w:after="0"/>
+        <w:ind w:left="-5" w:right="15"/>
+      </w:pPr>
+      <w:r>
+        <w:t>Under the United Nations Oil-for-Food Programme, Iraq shifted the programme’s accounting and letters of credit from dollars to euros in November 2000. The invasion began 20 March 2003. The Iraq Survey Group later found no stockpiles corresponding to the principal prewar claims. These facts establish the chronology; they do not establish that the currency decision caused the invasion. UN Office of the Iraq Programme, Weekly Update 11–17 November 2000; Charles</w:t>
+      </w:r>
+    </w:p>
+    <w:p>
+      <w:pPr>
+        <w:ind w:left="-5" w:right="15"/>
+      </w:pPr>
+      <w:r>
+        <w:t>Duelfer, Comprehensive Report of the Special Advisor to the DCI on Iraq’s WMD, 30 September 2004. SEQUENCE ESTABLISHED; CAUSATION NOT ESTABLISHED.</w:t>
       </w:r>
     </w:p>
     <w:p>
@@ -23019,24 +22482,15 @@
         <w:rPr>
           <w:b/>
         </w:rPr>
-        <w:t>14. Chapter Eight: Iraq and the euro</w:t>
-      </w:r>
-    </w:p>
-    <w:p>
-      <w:pPr>
-        <w:spacing w:after="0"/>
-        <w:ind w:left="-5" w:right="15"/>
-      </w:pPr>
-      <w:r>
-        <w:t>Under the United Nations Oil-for-Food Programme, Iraq shifted the programme’s accounting and letters of credit from dollars to euros in November 2000. The invasion began 20 March 2003. The Iraq Survey Group later found no stockpiles corresponding to the principal prewar claims. These facts establish the chronology; they do not establish that the currency decision caused the invasion. UN Office of the Iraq Programme, Weekly Update 11–17 November 2000; Charles</w:t>
-      </w:r>
-    </w:p>
-    <w:p>
-      <w:pPr>
-        <w:ind w:left="-5" w:right="15"/>
-      </w:pPr>
-      <w:r>
-        <w:t>Duelfer, Comprehensive Report of the Special Advisor to the DCI on Iraq’s WMD, 30 September 2004. SEQUENCE ESTABLISHED; CAUSATION NOT ESTABLISHED.</w:t>
+        <w:t>Chapter Eight: the dollar channel</w:t>
+      </w:r>
+    </w:p>
+    <w:p>
+      <w:pPr>
+        <w:ind w:left="-5" w:right="15"/>
+      </w:pPr>
+      <w:r>
+        <w:t>During the 1970s the United States and Saudi Arabia created economic, technical, investment, and security arrangements that encouraged Saudi oil revenues to circulate through dollar-denominated markets and U.S. government securities. Oil was already predominantly invoiced in dollars, and the scale and liquidity of American capital markets reinforced the convention. The record does not establish a single exclusive fifty-year contract requiring every Saudi oil sale to be made in dollars, and no such agreement expired in 2024. U.S. Government Accountability Office, ID-79-7 (1979); AFP Fact Check on the claimed petrodollar expiry. OFFICIAL RECORD; THE VIRAL EXPIRY CLAIM IS FALSE.</w:t>
       </w:r>
     </w:p>
     <w:p>
@@ -23052,15 +22506,15 @@
         <w:rPr>
           <w:b/>
         </w:rPr>
-        <w:t>15. Chapter Eight: the dollar channel</w:t>
-      </w:r>
-    </w:p>
-    <w:p>
-      <w:pPr>
-        <w:ind w:left="-5" w:right="15"/>
-      </w:pPr>
-      <w:r>
-        <w:t>During the 1970s the United States and Saudi Arabia created economic, technical, investment, and security arrangements that encouraged Saudi oil revenues to circulate through dollar-denominated markets and U.S. government securities. Oil was already predominantly invoiced in dollars, and the scale and liquidity of American capital markets reinforced the convention. The record does not establish a single exclusive fifty-year contract requiring every Saudi oil sale to be made in dollars, and no such agreement expired in 2024. U.S. Government Accountability Office, ID-79-7 (1979); AFP Fact Check on the claimed petrodollar expiry. OFFICIAL RECORD; THE VIRAL EXPIRY CLAIM IS FALSE.</w:t>
+        <w:t>Chapter Eight: post-1945 deaths</w:t>
+      </w:r>
+    </w:p>
+    <w:p>
+      <w:pPr>
+        <w:ind w:left="-5" w:right="15"/>
+      </w:pPr>
+      <w:r>
+        <w:t>No single accepted total exists, because the datasets answer different questions. PRIO and UCDP distinguish battle deaths from one-sided violence and apply thresholds for inclusion as an armed conflict; public-health and historical estimates may add indirect deaths from disease, hunger, displacement, infrastructure failure, and loss of medical care. Estimates for the twentieth century as a whole range from roughly 110 million counting direct violence to over 200 million including war-induced famine and disease, with the World Wars accounting for most of it. Strict conflict-event datasets support the claim that post-1945 armed conflicts have directly killed tens of millions. PRIO Battle Deaths Dataset; Uppsala Conflict Data Program. OFFICIAL DATASETS; TOTALS DEPEND ON INCLUSION RULES.</w:t>
       </w:r>
     </w:p>
     <w:p>
@@ -23076,15 +22530,15 @@
         <w:rPr>
           <w:b/>
         </w:rPr>
-        <w:t>16. Chapter Eight: post-1945 deaths</w:t>
-      </w:r>
-    </w:p>
-    <w:p>
-      <w:pPr>
-        <w:ind w:left="-5" w:right="15"/>
-      </w:pPr>
-      <w:r>
-        <w:t>No single accepted total exists, because the datasets answer different questions. PRIO and UCDP distinguish battle deaths from one-sided violence and apply thresholds for inclusion as an armed conflict; public-health and historical estimates may add indirect deaths from disease, hunger, displacement, infrastructure failure, and loss of medical care. Estimates for the twentieth century as a whole range from roughly 110 million counting direct violence to over 200 million including war-induced famine and disease, with the World Wars accounting for most of it. Strict conflict-event datasets support the claim that post-1945 armed conflicts have directly killed tens of millions. PRIO Battle Deaths Dataset; Uppsala Conflict Data Program. OFFICIAL DATASETS; TOTALS DEPEND ON INCLUSION RULES.</w:t>
+        <w:t>Chapter Eight: Loki Law</w:t>
+      </w:r>
+    </w:p>
+    <w:p>
+      <w:pPr>
+        <w:ind w:left="-5" w:right="15"/>
+      </w:pPr>
+      <w:r>
+        <w:t>Loki Law is the author’s own animal-accountability policy, written after the death of a French bulldog from heat exposure following a gap in a handoff of responsibility. Its governing rule is one animal, one named keeper, never a team and never a shift, with responsibility transferring only on explicit logged acceptance. AUTHOR’S PRIMARY DOCUMENT.</w:t>
       </w:r>
     </w:p>
     <w:p>
@@ -23100,15 +22554,15 @@
         <w:rPr>
           <w:b/>
         </w:rPr>
-        <w:t>17. Chapter Eight: Loki Law</w:t>
-      </w:r>
-    </w:p>
-    <w:p>
-      <w:pPr>
-        <w:ind w:left="-5" w:right="15"/>
-      </w:pPr>
-      <w:r>
-        <w:t>Loki Law is the author’s own animal-accountability policy, written after the death of a French bulldog from heat exposure following a gap in a handoff of responsibility. Its governing rule is one animal, one named keeper, never a team and never a shift, with responsibility transferring only on explicit logged acceptance. AUTHOR’S PRIMARY DOCUMENT.</w:t>
+        <w:t>Chapter Nine: Helaman</w:t>
+      </w:r>
+    </w:p>
+    <w:p>
+      <w:pPr>
+        <w:ind w:left="-5" w:right="15"/>
+      </w:pPr>
+      <w:r>
+        <w:t>Helaman 2:13 states that the rise of the Gadianton robbers did prove the overthrow, yea, almost the entire destruction of the people of Nephi. The Book of Mormon’s historicity is a matter of religious faith rather than settled archaeology; no independent archaeological evidence confirms the Gadianton narrative as literal history, and this book uses it as a textually sophisticated model of institutional capture rather than as a historical source. Separately, there is an actively debated scholarly literature on the anti-Masonic context surrounding the 1830 publication. PRIMARY TEXT; HISTORICITY NOT INDEPENDENTLY ESTABLISHED.</w:t>
       </w:r>
     </w:p>
     <w:p>
@@ -23124,15 +22578,24 @@
         <w:rPr>
           <w:b/>
         </w:rPr>
-        <w:t>18. Chapter Nine: Helaman</w:t>
-      </w:r>
-    </w:p>
-    <w:p>
-      <w:pPr>
-        <w:ind w:left="-5" w:right="15"/>
-      </w:pPr>
-      <w:r>
-        <w:t>Helaman 2:13 states that the rise of the Gadianton robbers did prove the overthrow, yea, almost the entire destruction of the people of Nephi. The Book of Mormon’s historicity is a matter of religious faith rather than settled archaeology; no independent archaeological evidence confirms the Gadianton narrative as literal history, and this book uses it as a textually sophisticated model of institutional capture rather than as a historical source. Separately, there is an actively debated scholarly literature on the anti-Masonic context surrounding the 1830 publication. PRIMARY TEXT; HISTORICITY NOT INDEPENDENTLY ESTABLISHED.</w:t>
+        <w:t>Chapter Nine: confirmation bias</w:t>
+      </w:r>
+    </w:p>
+    <w:p>
+      <w:pPr>
+        <w:spacing w:after="0"/>
+        <w:ind w:left="-5" w:right="15"/>
+      </w:pPr>
+      <w:r>
+        <w:t>Peter Wason’s 1960 experiment documented a tendency to test a proposed rule by seeking confirming instances rather than efficiently attempting falsification. Raymond Nickerson’s 1998 review examined the bias across many domains and described it as widespread in numerous forms. Neither source establishes that every person always seeks confirmation, or that the tendency cannot be resisted. Wason, Quarterly Journal of Experimental Psychology 12, no. 3 (1960): 129–140; Nickerson,</w:t>
+      </w:r>
+    </w:p>
+    <w:p>
+      <w:pPr>
+        <w:ind w:left="-5" w:right="15"/>
+      </w:pPr>
+      <w:r>
+        <w:t>Review of General Psychology 2, no. 2 (1998): 175–220. ESTABLISHED FINDING; TENDENCY, NOT UNIVERSAL LAW.</w:t>
       </w:r>
     </w:p>
     <w:p>
@@ -23148,7 +22611,7 @@
         <w:rPr>
           <w:b/>
         </w:rPr>
-        <w:t>19. Chapter Nine: confirmation bias</w:t>
+        <w:t>Chapter Nine: Constantine and the Janissaries</w:t>
       </w:r>
     </w:p>
     <w:p>
@@ -23157,15 +22620,15 @@
         <w:ind w:left="-5" w:right="15"/>
       </w:pPr>
       <w:r>
-        <w:t>Peter Wason’s 1960 experiment documented a tendency to test a proposed rule by seeking confirming instances rather than efficiently attempting falsification. Raymond Nickerson’s 1998 review examined the bias across many domains and described it as widespread in numerous forms. Neither source establishes that every person always seeks confirmation, or that the tendency cannot be resisted. Wason, Quarterly Journal of Experimental Psychology 12, no. 3 (1960): 129–140; Nickerson,</w:t>
-      </w:r>
-    </w:p>
-    <w:p>
-      <w:pPr>
-        <w:ind w:left="-5" w:right="15"/>
-      </w:pPr>
-      <w:r>
-        <w:t>Review of General Psychology 2, no. 2 (1998): 175–220. ESTABLISHED FINDING; TENDENCY, NOT UNIVERSAL LAW.</w:t>
+        <w:t>Constantine defeated Maxentius at the Milvian Bridge in 312 and then abolished the Praetorian Guard, destroyed its barracks, and dispersed the survivors.</w:t>
+      </w:r>
+    </w:p>
+    <w:p>
+      <w:pPr>
+        <w:ind w:left="-5" w:right="15"/>
+      </w:pPr>
+      <w:r>
+        <w:t>Constantinople was founded and developed later; relocation of the imperial center was not the prior cause of the abolition. In June 1826 Mahmud II used military force against the Janissaries, abolished the corps, and established a replacement order, in the event remembered as the Auspicious Incident. David S. Potter, Constantine the Emperor (Oxford, 2013); Virginia H. Aksan, Ottoman Wars 1700–1870 (Pearson, 2007). HISTORICAL RECORD; CHRONOLOGY CORRECTED.</w:t>
       </w:r>
     </w:p>
     <w:p>
@@ -23181,24 +22644,15 @@
         <w:rPr>
           <w:b/>
         </w:rPr>
-        <w:t>20. Chapter Nine: Constantine and the Janissaries</w:t>
-      </w:r>
-    </w:p>
-    <w:p>
-      <w:pPr>
-        <w:spacing w:after="0"/>
-        <w:ind w:left="-5" w:right="15"/>
-      </w:pPr>
-      <w:r>
-        <w:t>Constantine defeated Maxentius at the Milvian Bridge in 312 and then abolished the Praetorian Guard, destroyed its barracks, and dispersed the survivors.</w:t>
-      </w:r>
-    </w:p>
-    <w:p>
-      <w:pPr>
-        <w:ind w:left="-5" w:right="15"/>
-      </w:pPr>
-      <w:r>
-        <w:t>Constantinople was founded and developed later; relocation of the imperial center was not the prior cause of the abolition. In June 1826 Mahmud II used military force against the Janissaries, abolished the corps, and established a replacement order, in the event remembered as the Auspicious Incident. David S. Potter, Constantine the Emperor (Oxford, 2013); Virginia H. Aksan, Ottoman Wars 1700–1870 (Pearson, 2007). HISTORICAL RECORD; CHRONOLOGY CORRECTED.</w:t>
+        <w:t>Chapter Ten: Venezuela</w:t>
+      </w:r>
+    </w:p>
+    <w:p>
+      <w:pPr>
+        <w:ind w:left="-5" w:right="15"/>
+      </w:pPr>
+      <w:r>
+        <w:t>Venezuela possesses among the world’s largest proven crude-oil reserves, but much of the resource is extra-heavy crude requiring diluent, upgrading, specialised refining, maintained infrastructure, capital, technical expertise, transport, and access to buyers. U.S. sanctions constrained financing, trade, equipment, and some access to imported diluent. Long-term underinvestment, loss of technical capacity, infrastructure deterioration, and domestic policy decisions also contributed to the production collapse. The evidence supports a multicausal account. U.S. Energy Information Administration, Venezuela Country Analysis. OFFICIAL ESTIMATE; MULTICAUSAL.</w:t>
       </w:r>
     </w:p>
     <w:p>
@@ -23214,15 +22668,51 @@
         <w:rPr>
           <w:b/>
         </w:rPr>
-        <w:t>21. Chapter Ten: Venezuela</w:t>
-      </w:r>
-    </w:p>
-    <w:p>
-      <w:pPr>
-        <w:ind w:left="-5" w:right="15"/>
-      </w:pPr>
-      <w:r>
-        <w:t>Venezuela possesses among the world’s largest proven crude-oil reserves, but much of the resource is extra-heavy crude requiring diluent, upgrading, specialised refining, maintained infrastructure, capital, technical expertise, transport, and access to buyers. U.S. sanctions constrained financing, trade, equipment, and some access to imported diluent. Long-term underinvestment, loss of technical capacity, infrastructure deterioration, and domestic policy decisions also contributed to the production collapse. The evidence supports a multicausal account. U.S. Energy Information Administration, Venezuela Country Analysis. OFFICIAL ESTIMATE; MULTICAUSAL.</w:t>
+        <w:t>Chapter Eleven: the Jubilee</w:t>
+      </w:r>
+    </w:p>
+    <w:p>
+      <w:pPr>
+        <w:spacing w:after="0"/>
+        <w:ind w:left="-5" w:right="15"/>
+      </w:pPr>
+      <w:r>
+        <w:t xml:space="preserve">Leviticus 25 describes the fiftieth-year Jubilee, including restoration of ancestral land and release of Israelite bonded servants; Deuteronomy 15 describes a seventhyear release of debts. The texts are evidence for legal/religious prescriptions, not by themselves proof of how uniformly the rules were practiced historically. Mesopotamian rulers issued earlier clean-slate proclamations involving specified debts, arrears, property, and debt servitude. Sumerian </w:t>
+      </w:r>
+      <w:r>
+        <w:rPr>
+          <w:i/>
+        </w:rPr>
+        <w:t>amargi</w:t>
+      </w:r>
+      <w:r>
+        <w:t xml:space="preserve"> is an early term associated with release or restoration and is often glossed literally as “return to the mother”; claims that it is simply the first written word for modern “freedom” compress a debated linguistic and institutional history. The Akkadian </w:t>
+      </w:r>
+      <w:r>
+        <w:rPr>
+          <w:i/>
+        </w:rPr>
+        <w:t xml:space="preserve">andurārum </w:t>
+      </w:r>
+      <w:r>
+        <w:t xml:space="preserve">and Hebrew </w:t>
+      </w:r>
+      <w:r>
+        <w:rPr>
+          <w:i/>
+        </w:rPr>
+        <w:t>deror</w:t>
+      </w:r>
+      <w:r>
+        <w:t xml:space="preserve"> belong to the broader ancient vocabulary of release.</w:t>
+      </w:r>
+    </w:p>
+    <w:p>
+      <w:pPr>
+        <w:ind w:left="-5" w:right="15"/>
+      </w:pPr>
+      <w:r>
+        <w:t>ESTABLISHED TEXTS; HISTORICAL PRACTICE AND TRANSLATION REQUIRE QUALIFICATION.</w:t>
       </w:r>
     </w:p>
     <w:p>
@@ -23238,7 +22728,7 @@
         <w:rPr>
           <w:b/>
         </w:rPr>
-        <w:t>22. Chapter Eleven: the Jubilee</w:t>
+        <w:t>Chapter Eleven: London Debt Agreement</w:t>
       </w:r>
     </w:p>
     <w:p>
@@ -23247,42 +22737,15 @@
         <w:ind w:left="-5" w:right="15"/>
       </w:pPr>
       <w:r>
-        <w:t xml:space="preserve">Leviticus 25 describes the fiftieth-year Jubilee, including restoration of ancestral land and release of Israelite bonded servants; Deuteronomy 15 describes a seventhyear release of debts. The texts are evidence for legal/religious prescriptions, not by themselves proof of how uniformly the rules were practiced historically. Mesopotamian rulers issued earlier clean-slate proclamations involving specified debts, arrears, property, and debt servitude. Sumerian </w:t>
-      </w:r>
-      <w:r>
-        <w:rPr>
-          <w:i/>
-        </w:rPr>
-        <w:t>amargi</w:t>
-      </w:r>
-      <w:r>
-        <w:t xml:space="preserve"> is an early term associated with release or restoration and is often glossed literally as “return to the mother”; claims that it is simply the first written word for modern “freedom” compress a debated linguistic and institutional history. The Akkadian </w:t>
-      </w:r>
-      <w:r>
-        <w:rPr>
-          <w:i/>
-        </w:rPr>
-        <w:t xml:space="preserve">andurārum </w:t>
-      </w:r>
-      <w:r>
-        <w:t xml:space="preserve">and Hebrew </w:t>
-      </w:r>
-      <w:r>
-        <w:rPr>
-          <w:i/>
-        </w:rPr>
-        <w:t>deror</w:t>
-      </w:r>
-      <w:r>
-        <w:t xml:space="preserve"> belong to the broader ancient vocabulary of release.</w:t>
-      </w:r>
-    </w:p>
-    <w:p>
-      <w:pPr>
-        <w:ind w:left="-5" w:right="15"/>
-      </w:pPr>
-      <w:r>
-        <w:t>ESTABLISHED TEXTS; HISTORICAL PRACTICE AND TRANSLATION REQUIRE QUALIFICATION.</w:t>
+        <w:t>The 1953 London Agreement substantially reduced and restructured West Germany’s external debt, extended repayment periods, lowered the interest burden, and tied effective debt service to Germany’s capacity to earn foreign exchange through exports. Research finds the settlement materially improved fiscal space, creditworthiness, investment conditions, and reintegration into international trade. It was an important contributor to the conditions for recovery, not the sole cause of the Wirtschaftswunder. Agreement on German External Debts, London, 27 February 1953; Galofré-Vilà, Meissner, McKee and Stuckler, European Review of Economic History 23, no. 1 (2019): 1–29. TREATY</w:t>
+      </w:r>
+    </w:p>
+    <w:p>
+      <w:pPr>
+        <w:ind w:left="-5" w:right="15"/>
+      </w:pPr>
+      <w:r>
+        <w:t>TEXT AND PEER-REVIEWED ANALYSIS.</w:t>
       </w:r>
     </w:p>
     <w:p>
@@ -23298,24 +22761,15 @@
         <w:rPr>
           <w:b/>
         </w:rPr>
-        <w:t>23. Chapter Eleven: London Debt Agreement</w:t>
-      </w:r>
-    </w:p>
-    <w:p>
-      <w:pPr>
-        <w:spacing w:after="0"/>
-        <w:ind w:left="-5" w:right="15"/>
-      </w:pPr>
-      <w:r>
-        <w:t>The 1953 London Agreement substantially reduced and restructured West Germany’s external debt, extended repayment periods, lowered the interest burden, and tied effective debt service to Germany’s capacity to earn foreign exchange through exports. Research finds the settlement materially improved fiscal space, creditworthiness, investment conditions, and reintegration into international trade. It was an important contributor to the conditions for recovery, not the sole cause of the Wirtschaftswunder. Agreement on German External Debts, London, 27 February 1953; Galofré-Vilà, Meissner, McKee and Stuckler, European Review of Economic History 23, no. 1 (2019): 1–29. TREATY</w:t>
-      </w:r>
-    </w:p>
-    <w:p>
-      <w:pPr>
-        <w:ind w:left="-5" w:right="15"/>
-      </w:pPr>
-      <w:r>
-        <w:t>TEXT AND PEER-REVIEWED ANALYSIS.</w:t>
+        <w:t>Chapter Twelve: Asimov</w:t>
+      </w:r>
+    </w:p>
+    <w:p>
+      <w:pPr>
+        <w:ind w:left="-5" w:right="15"/>
+      </w:pPr>
+      <w:r>
+        <w:t>The robot stories collected as I, Robot were written between 1940 and 1950. The Three Laws are stated in Runaround (1942). Most of the stories turn on the Laws producing an unintended outcome while being followed exactly. ESTABLISHED PUBLICATION HISTORY.</w:t>
       </w:r>
     </w:p>
     <w:p>
@@ -23331,7 +22785,7 @@
         <w:rPr>
           <w:b/>
         </w:rPr>
-        <w:t>24. Chapter Twelve: humanoid production targets</w:t>
+        <w:t>Chapter Twelve: humanoid production targets</w:t>
       </w:r>
     </w:p>
     <w:p>
@@ -23355,15 +22809,15 @@
         <w:rPr>
           <w:b/>
         </w:rPr>
-        <w:t>25. Chapter Twelve: Asimov</w:t>
-      </w:r>
-    </w:p>
-    <w:p>
-      <w:pPr>
-        <w:ind w:left="-5" w:right="15"/>
-      </w:pPr>
-      <w:r>
-        <w:t>The robot stories collected as I, Robot were written between 1940 and 1950. The Three Laws are stated in Runaround (1942). Most of the stories turn on the Laws producing an unintended outcome while being followed exactly. ESTABLISHED PUBLICATION HISTORY.</w:t>
+        <w:t>Chapter One: Alan Watts</w:t>
+      </w:r>
+    </w:p>
+    <w:p>
+      <w:pPr>
+        <w:ind w:left="-5" w:right="15"/>
+      </w:pPr>
+      <w:r>
+        <w:t>The distinction between a narrow, deliberate spotlight consciousness and a broad, ambient floodlight consciousness recurs across Watts’s lectures and writing. The observation that conscious attention is at the same time ignore-ance appears in The Book: On the Taboo Against Knowing Who You Are (1966). The phrasing here paraphrases rather than quotes. PARAPHRASE OF PUBLISHED SOURCE.</w:t>
       </w:r>
     </w:p>
     <w:p>

</xml_diff>